<commit_message>
NOVA V1.0 ajustes de seguridad
</commit_message>
<xml_diff>
--- a/documentation/NOVA_Informe_Comercial.docx
+++ b/documentation/NOVA_Informe_Comercial.docx
@@ -22,12 +22,18 @@
           <w:left w:w="10" w:type="dxa"/>
           <w:right w:w="10" w:type="dxa"/>
         </w:tblCellMar>
-        <w:tblLook w:val="04A0" w:firstRow="1" w:lastRow="0" w:firstColumn="1" w:lastColumn="0" w:noHBand="0" w:noVBand="1"/>
+        <w:tblLook w:val="0000" w:firstRow="0" w:lastRow="0" w:firstColumn="0" w:lastColumn="0" w:noHBand="0" w:noVBand="0"/>
       </w:tblPr>
       <w:tblGrid>
         <w:gridCol w:w="9760"/>
       </w:tblGrid>
       <w:tr>
+        <w:tblPrEx>
+          <w:tblCellMar>
+            <w:top w:w="0" w:type="dxa"/>
+            <w:bottom w:w="0" w:type="dxa"/>
+          </w:tblCellMar>
+        </w:tblPrEx>
         <w:tc>
           <w:tcPr>
             <w:tcW w:w="9760" w:type="dxa"/>
@@ -57,27 +63,7 @@
                 <w:sz w:val="56"/>
                 <w:szCs w:val="56"/>
               </w:rPr>
-              <w:t>NOVA v</w:t>
-            </w:r>
-            <w:r>
-              <w:rPr>
-                <w:b/>
-                <w:bCs/>
-                <w:color w:val="FFFFFF"/>
-                <w:sz w:val="56"/>
-                <w:szCs w:val="56"/>
-              </w:rPr>
-              <w:t>1</w:t>
-            </w:r>
-            <w:r>
-              <w:rPr>
-                <w:b/>
-                <w:bCs/>
-                <w:color w:val="FFFFFF"/>
-                <w:sz w:val="56"/>
-                <w:szCs w:val="56"/>
-              </w:rPr>
-              <w:t>.0</w:t>
+              <w:t>NOVA v1.0</w:t>
             </w:r>
           </w:p>
           <w:p>
@@ -91,16 +77,13 @@
                 <w:sz w:val="26"/>
                 <w:szCs w:val="26"/>
               </w:rPr>
-              <w:t>Informe Comercial — Propuesta de Valor y Beneficios para el Negocio</w:t>
+              <w:t>Informe Comercial — Propuesta de Valor y Beneficios</w:t>
             </w:r>
           </w:p>
           <w:p>
             <w:pPr>
               <w:spacing w:before="80"/>
               <w:jc w:val="center"/>
-              <w:rPr>
-                <w:u w:val="single"/>
-              </w:rPr>
             </w:pPr>
             <w:proofErr w:type="spellStart"/>
             <w:r>
@@ -114,25 +97,7 @@
               <w:rPr>
                 <w:color w:val="DDD6FE"/>
               </w:rPr>
-              <w:t xml:space="preserve"> </w:t>
-            </w:r>
-            <w:r>
-              <w:rPr>
-                <w:color w:val="DDD6FE"/>
-              </w:rPr>
-              <w:t>1</w:t>
-            </w:r>
-            <w:r>
-              <w:rPr>
-                <w:color w:val="DDD6FE"/>
-              </w:rPr>
-              <w:t>.0.0  |  202</w:t>
-            </w:r>
-            <w:r>
-              <w:rPr>
-                <w:color w:val="DDD6FE"/>
-              </w:rPr>
-              <w:t>6</w:t>
+              <w:t xml:space="preserve"> 1.0.0  |  2026</w:t>
             </w:r>
           </w:p>
         </w:tc>
@@ -170,7 +135,35 @@
         <w:rPr>
           <w:color w:val="111827"/>
         </w:rPr>
-        <w:t xml:space="preserve">NOVA es una plataforma digital que transforma la </w:t>
+        <w:t xml:space="preserve">NOVA v1.0 es la primera </w:t>
+      </w:r>
+      <w:proofErr w:type="spellStart"/>
+      <w:r>
+        <w:rPr>
+          <w:color w:val="111827"/>
+        </w:rPr>
+        <w:t>version</w:t>
+      </w:r>
+      <w:proofErr w:type="spellEnd"/>
+      <w:r>
+        <w:rPr>
+          <w:color w:val="111827"/>
+        </w:rPr>
+        <w:t xml:space="preserve"> estable de una plataforma digital </w:t>
+      </w:r>
+      <w:proofErr w:type="spellStart"/>
+      <w:r>
+        <w:rPr>
+          <w:color w:val="111827"/>
+        </w:rPr>
+        <w:t>disenada</w:t>
+      </w:r>
+      <w:proofErr w:type="spellEnd"/>
+      <w:r>
+        <w:rPr>
+          <w:color w:val="111827"/>
+        </w:rPr>
+        <w:t xml:space="preserve"> para transformar la </w:t>
       </w:r>
       <w:proofErr w:type="spellStart"/>
       <w:r>
@@ -184,7 +177,7 @@
         <w:rPr>
           <w:color w:val="111827"/>
         </w:rPr>
-        <w:t xml:space="preserve"> de ausencias, permisos e incapacidades del personal. Reemplaza procesos informales (mensajes de WhatsApp, correos sin trazabilidad, hojas de </w:t>
+        <w:t xml:space="preserve"> de ausencias, permisos e incapacidades del personal. Lanzada en 2026, reemplaza procesos informales basados en mensajes de WhatsApp, correos sin registro y hojas de </w:t>
       </w:r>
       <w:proofErr w:type="spellStart"/>
       <w:r>
@@ -198,7 +191,7 @@
         <w:rPr>
           <w:color w:val="111827"/>
         </w:rPr>
-        <w:t>) por un sistema centralizado, auditado y potenciado con inteligencia artificial.</w:t>
+        <w:t>, por un sistema centralizado, trazable, con inteligencia artificial incorporada y medidas de seguridad que protegen los datos del personal.</w:t>
       </w:r>
     </w:p>
     <w:p>
@@ -209,35 +202,21 @@
         <w:rPr>
           <w:color w:val="111827"/>
         </w:rPr>
-        <w:t xml:space="preserve">El sistema </w:t>
-      </w:r>
-      <w:proofErr w:type="spellStart"/>
-      <w:r>
-        <w:rPr>
-          <w:color w:val="111827"/>
-        </w:rPr>
-        <w:t>esta</w:t>
-      </w:r>
-      <w:proofErr w:type="spellEnd"/>
-      <w:r>
-        <w:rPr>
-          <w:color w:val="111827"/>
-        </w:rPr>
-        <w:t xml:space="preserve"> listo para </w:t>
-      </w:r>
-      <w:proofErr w:type="spellStart"/>
-      <w:r>
-        <w:rPr>
-          <w:color w:val="111827"/>
-        </w:rPr>
-        <w:t>produccion</w:t>
-      </w:r>
-      <w:proofErr w:type="spellEnd"/>
-      <w:r>
-        <w:rPr>
-          <w:color w:val="111827"/>
-        </w:rPr>
-        <w:t xml:space="preserve">, desplegado en la nube y opera con un costo fijo de $7 USD mensuales (plan Starter de Render), que garantiza servidor siempre activo, </w:t>
+        <w:t xml:space="preserve">El sistema opera con un costo fijo de $7 USD mensuales — el </w:t>
+      </w:r>
+      <w:proofErr w:type="spellStart"/>
+      <w:r>
+        <w:rPr>
+          <w:color w:val="111827"/>
+        </w:rPr>
+        <w:t>unico</w:t>
+      </w:r>
+      <w:proofErr w:type="spellEnd"/>
+      <w:r>
+        <w:rPr>
+          <w:color w:val="111827"/>
+        </w:rPr>
+        <w:t xml:space="preserve"> gasto real — que cubre el servidor con puertos SMTP habilitados para el </w:t>
       </w:r>
       <w:proofErr w:type="spellStart"/>
       <w:r>
@@ -251,7 +230,21 @@
         <w:rPr>
           <w:color w:val="111827"/>
         </w:rPr>
-        <w:t xml:space="preserve"> de emails a cualquier correo del mundo sin restricciones y redespliegues ilimitados sin costo adicional.</w:t>
+        <w:t xml:space="preserve"> de emails a cualquier correo del mundo sin restricciones. El resto de servicios (base de datos de </w:t>
+      </w:r>
+      <w:proofErr w:type="spellStart"/>
+      <w:r>
+        <w:rPr>
+          <w:color w:val="111827"/>
+        </w:rPr>
+        <w:t>auditoria</w:t>
+      </w:r>
+      <w:proofErr w:type="spellEnd"/>
+      <w:r>
+        <w:rPr>
+          <w:color w:val="111827"/>
+        </w:rPr>
+        <w:t>, almacenamiento de archivos, inteligencia artificial y correo transaccional) operan en planes gratuitos.</w:t>
       </w:r>
     </w:p>
     <w:p>
@@ -295,13 +288,19 @@
           <w:left w:w="10" w:type="dxa"/>
           <w:right w:w="10" w:type="dxa"/>
         </w:tblCellMar>
-        <w:tblLook w:val="04A0" w:firstRow="1" w:lastRow="0" w:firstColumn="1" w:lastColumn="0" w:noHBand="0" w:noVBand="1"/>
+        <w:tblLook w:val="0000" w:firstRow="0" w:lastRow="0" w:firstColumn="0" w:lastColumn="0" w:noHBand="0" w:noVBand="0"/>
       </w:tblPr>
       <w:tblGrid>
         <w:gridCol w:w="4880"/>
         <w:gridCol w:w="4880"/>
       </w:tblGrid>
       <w:tr>
+        <w:tblPrEx>
+          <w:tblCellMar>
+            <w:top w:w="0" w:type="dxa"/>
+            <w:bottom w:w="0" w:type="dxa"/>
+          </w:tblCellMar>
+        </w:tblPrEx>
         <w:tc>
           <w:tcPr>
             <w:tcW w:w="4880" w:type="dxa"/>
@@ -364,6 +363,12 @@
         </w:tc>
       </w:tr>
       <w:tr>
+        <w:tblPrEx>
+          <w:tblCellMar>
+            <w:top w:w="0" w:type="dxa"/>
+            <w:bottom w:w="0" w:type="dxa"/>
+          </w:tblCellMar>
+        </w:tblPrEx>
         <w:tc>
           <w:tcPr>
             <w:tcW w:w="4880" w:type="dxa"/>
@@ -434,7 +439,7 @@
                 <w:sz w:val="20"/>
                 <w:szCs w:val="20"/>
               </w:rPr>
-              <w:t xml:space="preserve">, adjunto y trazabilidad desde el primer </w:t>
+              <w:t xml:space="preserve">, adjunto y trazabilidad completa desde el primer </w:t>
             </w:r>
             <w:proofErr w:type="spellStart"/>
             <w:r>
@@ -450,6 +455,12 @@
         </w:tc>
       </w:tr>
       <w:tr>
+        <w:tblPrEx>
+          <w:tblCellMar>
+            <w:top w:w="0" w:type="dxa"/>
+            <w:bottom w:w="0" w:type="dxa"/>
+          </w:tblCellMar>
+        </w:tblPrEx>
         <w:tc>
           <w:tcPr>
             <w:tcW w:w="4880" w:type="dxa"/>
@@ -508,6 +519,12 @@
         </w:tc>
       </w:tr>
       <w:tr>
+        <w:tblPrEx>
+          <w:tblCellMar>
+            <w:top w:w="0" w:type="dxa"/>
+            <w:bottom w:w="0" w:type="dxa"/>
+          </w:tblCellMar>
+        </w:tblPrEx>
         <w:tc>
           <w:tcPr>
             <w:tcW w:w="4880" w:type="dxa"/>
@@ -578,7 +595,7 @@
                 <w:sz w:val="20"/>
                 <w:szCs w:val="20"/>
               </w:rPr>
-              <w:t xml:space="preserve">Flujo estandarizado con campo de </w:t>
+              <w:t xml:space="preserve">Flujo estandarizado con </w:t>
             </w:r>
             <w:proofErr w:type="spellStart"/>
             <w:r>
@@ -596,7 +613,7 @@
                 <w:sz w:val="20"/>
                 <w:szCs w:val="20"/>
               </w:rPr>
-              <w:t xml:space="preserve"> y </w:t>
+              <w:t xml:space="preserve"> obligatoria y </w:t>
             </w:r>
             <w:proofErr w:type="spellStart"/>
             <w:r>
@@ -630,6 +647,12 @@
         </w:tc>
       </w:tr>
       <w:tr>
+        <w:tblPrEx>
+          <w:tblCellMar>
+            <w:top w:w="0" w:type="dxa"/>
+            <w:bottom w:w="0" w:type="dxa"/>
+          </w:tblCellMar>
+        </w:tblPrEx>
         <w:tc>
           <w:tcPr>
             <w:tcW w:w="4880" w:type="dxa"/>
@@ -700,12 +723,18 @@
                 <w:sz w:val="20"/>
                 <w:szCs w:val="20"/>
               </w:rPr>
-              <w:t xml:space="preserve"> y patrones</w:t>
+              <w:t xml:space="preserve"> y patrones de absentismo</w:t>
             </w:r>
           </w:p>
         </w:tc>
       </w:tr>
       <w:tr>
+        <w:tblPrEx>
+          <w:tblCellMar>
+            <w:top w:w="0" w:type="dxa"/>
+            <w:bottom w:w="0" w:type="dxa"/>
+          </w:tblCellMar>
+        </w:tblPrEx>
         <w:tc>
           <w:tcPr>
             <w:tcW w:w="4880" w:type="dxa"/>
@@ -776,7 +805,7 @@
                 <w:sz w:val="20"/>
                 <w:szCs w:val="20"/>
               </w:rPr>
-              <w:t xml:space="preserve"> con resultado y </w:t>
+              <w:t xml:space="preserve"> a cualquier correo del mundo con resultado y </w:t>
             </w:r>
             <w:proofErr w:type="spellStart"/>
             <w:r>
@@ -788,18 +817,16 @@
               <w:t>observacion</w:t>
             </w:r>
             <w:proofErr w:type="spellEnd"/>
-            <w:r>
-              <w:rPr>
-                <w:color w:val="111827"/>
-                <w:sz w:val="20"/>
-                <w:szCs w:val="20"/>
-              </w:rPr>
-              <w:t xml:space="preserve"> del profesional</w:t>
-            </w:r>
           </w:p>
         </w:tc>
       </w:tr>
       <w:tr>
+        <w:tblPrEx>
+          <w:tblCellMar>
+            <w:top w:w="0" w:type="dxa"/>
+            <w:bottom w:w="0" w:type="dxa"/>
+          </w:tblCellMar>
+        </w:tblPrEx>
         <w:tc>
           <w:tcPr>
             <w:tcW w:w="4880" w:type="dxa"/>
@@ -824,7 +851,7 @@
                 <w:sz w:val="20"/>
                 <w:szCs w:val="20"/>
               </w:rPr>
-              <w:t>Carga masiva de usuarios: proceso manual propenso a errores</w:t>
+              <w:t>Carga de usuarios: proceso manual y propenso a errores</w:t>
             </w:r>
           </w:p>
         </w:tc>
@@ -862,7 +889,7 @@
                 <w:sz w:val="20"/>
                 <w:szCs w:val="20"/>
               </w:rPr>
-              <w:t xml:space="preserve"> CSV con </w:t>
+              <w:t xml:space="preserve"> masiva CSV con </w:t>
             </w:r>
             <w:proofErr w:type="spellStart"/>
             <w:r>
@@ -871,7 +898,7 @@
                 <w:sz w:val="20"/>
                 <w:szCs w:val="20"/>
               </w:rPr>
-              <w:t>deteccion</w:t>
+              <w:t>validacion</w:t>
             </w:r>
             <w:proofErr w:type="spellEnd"/>
             <w:r>
@@ -880,7 +907,7 @@
                 <w:sz w:val="20"/>
                 <w:szCs w:val="20"/>
               </w:rPr>
-              <w:t xml:space="preserve"> </w:t>
+              <w:t xml:space="preserve"> de formato, vista previa y </w:t>
             </w:r>
             <w:proofErr w:type="spellStart"/>
             <w:r>
@@ -889,31 +916,19 @@
                 <w:sz w:val="20"/>
                 <w:szCs w:val="20"/>
               </w:rPr>
-              <w:t>automatica</w:t>
-            </w:r>
-            <w:proofErr w:type="spellEnd"/>
-            <w:r>
-              <w:rPr>
-                <w:color w:val="111827"/>
-                <w:sz w:val="20"/>
-                <w:szCs w:val="20"/>
-              </w:rPr>
-              <w:t xml:space="preserve">, vista previa y </w:t>
-            </w:r>
-            <w:proofErr w:type="spellStart"/>
-            <w:r>
-              <w:rPr>
-                <w:color w:val="111827"/>
-                <w:sz w:val="20"/>
-                <w:szCs w:val="20"/>
-              </w:rPr>
-              <w:t>validacion</w:t>
+              <w:t>confirmacion</w:t>
             </w:r>
             <w:proofErr w:type="spellEnd"/>
           </w:p>
         </w:tc>
       </w:tr>
       <w:tr>
+        <w:tblPrEx>
+          <w:tblCellMar>
+            <w:top w:w="0" w:type="dxa"/>
+            <w:bottom w:w="0" w:type="dxa"/>
+          </w:tblCellMar>
+        </w:tblPrEx>
         <w:tc>
           <w:tcPr>
             <w:tcW w:w="4880" w:type="dxa"/>
@@ -984,7 +999,99 @@
                 <w:sz w:val="20"/>
                 <w:szCs w:val="20"/>
               </w:rPr>
-              <w:t>Auditoria completa en MongoDB con usuario, fecha, IP y detalle</w:t>
+              <w:t xml:space="preserve">Auditoria completa en MongoDB con usuario, fecha, IP y detalle de cada </w:t>
+            </w:r>
+            <w:proofErr w:type="spellStart"/>
+            <w:r>
+              <w:rPr>
+                <w:color w:val="111827"/>
+                <w:sz w:val="20"/>
+                <w:szCs w:val="20"/>
+              </w:rPr>
+              <w:t>accion</w:t>
+            </w:r>
+            <w:proofErr w:type="spellEnd"/>
+          </w:p>
+        </w:tc>
+      </w:tr>
+      <w:tr>
+        <w:tblPrEx>
+          <w:tblCellMar>
+            <w:top w:w="0" w:type="dxa"/>
+            <w:bottom w:w="0" w:type="dxa"/>
+          </w:tblCellMar>
+        </w:tblPrEx>
+        <w:tc>
+          <w:tcPr>
+            <w:tcW w:w="4880" w:type="dxa"/>
+            <w:tcBorders>
+              <w:top w:val="single" w:sz="1" w:space="0" w:color="D1D5DB"/>
+              <w:left w:val="single" w:sz="1" w:space="0" w:color="D1D5DB"/>
+              <w:bottom w:val="single" w:sz="1" w:space="0" w:color="D1D5DB"/>
+              <w:right w:val="single" w:sz="1" w:space="0" w:color="D1D5DB"/>
+            </w:tcBorders>
+            <w:shd w:val="clear" w:color="auto" w:fill="FFF1F2"/>
+            <w:tcMar>
+              <w:top w:w="100" w:type="dxa"/>
+              <w:left w:w="140" w:type="dxa"/>
+              <w:bottom w:w="100" w:type="dxa"/>
+              <w:right w:w="140" w:type="dxa"/>
+            </w:tcMar>
+          </w:tcPr>
+          <w:p>
+            <w:r>
+              <w:rPr>
+                <w:color w:val="111827"/>
+                <w:sz w:val="20"/>
+                <w:szCs w:val="20"/>
+              </w:rPr>
+              <w:t>Datos del personal expuestos en respuestas de API</w:t>
+            </w:r>
+          </w:p>
+        </w:tc>
+        <w:tc>
+          <w:tcPr>
+            <w:tcW w:w="4880" w:type="dxa"/>
+            <w:tcBorders>
+              <w:top w:val="single" w:sz="1" w:space="0" w:color="D1D5DB"/>
+              <w:left w:val="single" w:sz="1" w:space="0" w:color="D1D5DB"/>
+              <w:bottom w:val="single" w:sz="1" w:space="0" w:color="D1D5DB"/>
+              <w:right w:val="single" w:sz="1" w:space="0" w:color="D1D5DB"/>
+            </w:tcBorders>
+            <w:shd w:val="clear" w:color="auto" w:fill="F0FDF4"/>
+            <w:tcMar>
+              <w:top w:w="100" w:type="dxa"/>
+              <w:left w:w="140" w:type="dxa"/>
+              <w:bottom w:w="100" w:type="dxa"/>
+              <w:right w:w="140" w:type="dxa"/>
+            </w:tcMar>
+          </w:tcPr>
+          <w:p>
+            <w:r>
+              <w:rPr>
+                <w:color w:val="111827"/>
+                <w:sz w:val="20"/>
+                <w:szCs w:val="20"/>
+              </w:rPr>
+              <w:t>Campos sensibles (</w:t>
+            </w:r>
+            <w:proofErr w:type="spellStart"/>
+            <w:r>
+              <w:rPr>
+                <w:color w:val="111827"/>
+                <w:sz w:val="20"/>
+                <w:szCs w:val="20"/>
+              </w:rPr>
+              <w:t>password</w:t>
+            </w:r>
+            <w:proofErr w:type="spellEnd"/>
+            <w:r>
+              <w:rPr>
+                <w:color w:val="111827"/>
+                <w:sz w:val="20"/>
+                <w:szCs w:val="20"/>
+              </w:rPr>
+              <w:t>, tokens) excluidos de todas las respuestas de la API</w:t>
             </w:r>
           </w:p>
         </w:tc>
@@ -1016,7 +1123,7 @@
         <w:pStyle w:val="Ttulo2"/>
       </w:pPr>
       <w:r>
-        <w:t>3.1 Inteligencia Artificial integrada</w:t>
+        <w:t>3.1 Inteligencia Artificial integrada nativamente</w:t>
       </w:r>
     </w:p>
     <w:p>
@@ -1027,7 +1134,8 @@
         <w:rPr>
           <w:color w:val="111827"/>
         </w:rPr>
-        <w:t xml:space="preserve">NOVA incorpora el modelo </w:t>
+        <w:lastRenderedPageBreak/>
+        <w:t xml:space="preserve">NOVA v1.0 incorpora el modelo </w:t>
       </w:r>
       <w:proofErr w:type="spellStart"/>
       <w:r>
@@ -1069,7 +1177,35 @@
         <w:rPr>
           <w:color w:val="111827"/>
         </w:rPr>
-        <w:t xml:space="preserve"> Cloud en dos niveles:</w:t>
+        <w:t xml:space="preserve"> Cloud — uno de los modelos de lenguaje open-</w:t>
+      </w:r>
+      <w:proofErr w:type="spellStart"/>
+      <w:r>
+        <w:rPr>
+          <w:color w:val="111827"/>
+        </w:rPr>
+        <w:t>source</w:t>
+      </w:r>
+      <w:proofErr w:type="spellEnd"/>
+      <w:r>
+        <w:rPr>
+          <w:color w:val="111827"/>
+        </w:rPr>
+        <w:t xml:space="preserve"> </w:t>
+      </w:r>
+      <w:proofErr w:type="spellStart"/>
+      <w:r>
+        <w:rPr>
+          <w:color w:val="111827"/>
+        </w:rPr>
+        <w:t>mas</w:t>
+      </w:r>
+      <w:proofErr w:type="spellEnd"/>
+      <w:r>
+        <w:rPr>
+          <w:color w:val="111827"/>
+        </w:rPr>
+        <w:t xml:space="preserve"> avanzados disponibles en 2026 — en dos niveles operativos:</w:t>
       </w:r>
     </w:p>
     <w:p>
@@ -1081,11 +1217,19 @@
         </w:numPr>
         <w:spacing w:before="50" w:after="50"/>
       </w:pPr>
-      <w:r>
-        <w:rPr>
-          <w:color w:val="111827"/>
-        </w:rPr>
-        <w:t xml:space="preserve">Al crear la novedad: prioridad </w:t>
+      <w:proofErr w:type="spellStart"/>
+      <w:r>
+        <w:rPr>
+          <w:color w:val="111827"/>
+        </w:rPr>
+        <w:t>Asignacion</w:t>
+      </w:r>
+      <w:proofErr w:type="spellEnd"/>
+      <w:r>
+        <w:rPr>
+          <w:color w:val="111827"/>
+        </w:rPr>
+        <w:t xml:space="preserve"> </w:t>
       </w:r>
       <w:proofErr w:type="spellStart"/>
       <w:r>
@@ -1099,7 +1243,7 @@
         <w:rPr>
           <w:color w:val="111827"/>
         </w:rPr>
-        <w:t xml:space="preserve"> (Alta/Media/Baja) basada en tipo de solicitud y </w:t>
+        <w:t xml:space="preserve"> de prioridad (Alta/Media/Baja) en el momento de crear cada solicitud, basada en el tipo de novedad y la </w:t>
       </w:r>
       <w:proofErr w:type="spellStart"/>
       <w:r>
@@ -1113,8 +1257,16 @@
         <w:rPr>
           <w:color w:val="111827"/>
         </w:rPr>
-        <w:t>, con criterios de RRHH predefinidos</w:t>
-      </w:r>
+        <w:t xml:space="preserve"> del usuario, con criterios de RRHH configurados en el </w:t>
+      </w:r>
+      <w:proofErr w:type="spellStart"/>
+      <w:r>
+        <w:rPr>
+          <w:color w:val="111827"/>
+        </w:rPr>
+        <w:t>prompt</w:t>
+      </w:r>
+      <w:proofErr w:type="spellEnd"/>
     </w:p>
     <w:p>
       <w:pPr>
@@ -1125,12 +1277,19 @@
         </w:numPr>
         <w:spacing w:before="50" w:after="50"/>
       </w:pPr>
-      <w:r>
-        <w:rPr>
-          <w:color w:val="111827"/>
-        </w:rPr>
-        <w:lastRenderedPageBreak/>
-        <w:t xml:space="preserve">Bajo demanda: </w:t>
+      <w:proofErr w:type="spellStart"/>
+      <w:r>
+        <w:rPr>
+          <w:color w:val="111827"/>
+        </w:rPr>
+        <w:t>Analisis</w:t>
+      </w:r>
+      <w:proofErr w:type="spellEnd"/>
+      <w:r>
+        <w:rPr>
+          <w:color w:val="111827"/>
+        </w:rPr>
+        <w:t xml:space="preserve"> profundo bajo demanda para el administrador: </w:t>
       </w:r>
       <w:proofErr w:type="spellStart"/>
       <w:r>
@@ -1144,7 +1303,7 @@
         <w:rPr>
           <w:color w:val="111827"/>
         </w:rPr>
-        <w:t xml:space="preserve"> APROBAR/RECHAZAR/REVISAR, confianza 1-10, </w:t>
+        <w:t xml:space="preserve"> APROBAR/RECHAZAR/REVISAR, nivel de confianza 1-10, </w:t>
       </w:r>
       <w:proofErr w:type="spellStart"/>
       <w:r>
@@ -1158,7 +1317,35 @@
         <w:rPr>
           <w:color w:val="111827"/>
         </w:rPr>
-        <w:t xml:space="preserve"> de retroactividad, historial del usuario, alertas de inconsistencia y </w:t>
+        <w:t xml:space="preserve"> de retroactividad, </w:t>
+      </w:r>
+      <w:proofErr w:type="spellStart"/>
+      <w:r>
+        <w:rPr>
+          <w:color w:val="111827"/>
+        </w:rPr>
+        <w:t>dias</w:t>
+      </w:r>
+      <w:proofErr w:type="spellEnd"/>
+      <w:r>
+        <w:rPr>
+          <w:color w:val="111827"/>
+        </w:rPr>
+        <w:t xml:space="preserve"> de </w:t>
+      </w:r>
+      <w:proofErr w:type="spellStart"/>
+      <w:r>
+        <w:rPr>
+          <w:color w:val="111827"/>
+        </w:rPr>
+        <w:t>anticipacion</w:t>
+      </w:r>
+      <w:proofErr w:type="spellEnd"/>
+      <w:r>
+        <w:rPr>
+          <w:color w:val="111827"/>
+        </w:rPr>
+        <w:t xml:space="preserve">, historial completo del usuario, alertas de inconsistencia y </w:t>
       </w:r>
       <w:proofErr w:type="spellStart"/>
       <w:r>
@@ -1185,7 +1372,15 @@
         <w:pStyle w:val="Ttulo2"/>
       </w:pPr>
       <w:r>
-        <w:t>3.2 Emails sin restricciones a cualquier correo</w:t>
+        <w:t xml:space="preserve">3.2 Seguridad de nivel </w:t>
+      </w:r>
+      <w:proofErr w:type="spellStart"/>
+      <w:r>
+        <w:t>basico</w:t>
+      </w:r>
+      <w:proofErr w:type="spellEnd"/>
+      <w:r>
+        <w:t xml:space="preserve"> certificada en v1.0</w:t>
       </w:r>
     </w:p>
     <w:p>
@@ -1196,6 +1391,404 @@
         <w:rPr>
           <w:color w:val="111827"/>
         </w:rPr>
+        <w:t>NOVA v1.0 implementa un conjunto de medidas de seguridad que protegen el sistema y los datos del personal:</w:t>
+      </w:r>
+    </w:p>
+    <w:p>
+      <w:pPr>
+        <w:pStyle w:val="Prrafodelista"/>
+        <w:numPr>
+          <w:ilvl w:val="0"/>
+          <w:numId w:val="2"/>
+        </w:numPr>
+        <w:spacing w:before="50" w:after="50"/>
+      </w:pPr>
+      <w:proofErr w:type="spellStart"/>
+      <w:r>
+        <w:rPr>
+          <w:color w:val="111827"/>
+        </w:rPr>
+        <w:t>Headers</w:t>
+      </w:r>
+      <w:proofErr w:type="spellEnd"/>
+      <w:r>
+        <w:rPr>
+          <w:color w:val="111827"/>
+        </w:rPr>
+        <w:t xml:space="preserve"> HTTP de seguridad </w:t>
+      </w:r>
+      <w:proofErr w:type="spellStart"/>
+      <w:r>
+        <w:rPr>
+          <w:color w:val="111827"/>
+        </w:rPr>
+        <w:t>via</w:t>
+      </w:r>
+      <w:proofErr w:type="spellEnd"/>
+      <w:r>
+        <w:rPr>
+          <w:color w:val="111827"/>
+        </w:rPr>
+        <w:t xml:space="preserve"> helmet.js: </w:t>
+      </w:r>
+      <w:proofErr w:type="spellStart"/>
+      <w:r>
+        <w:rPr>
+          <w:color w:val="111827"/>
+        </w:rPr>
+        <w:t>proteccion</w:t>
+      </w:r>
+      <w:proofErr w:type="spellEnd"/>
+      <w:r>
+        <w:rPr>
+          <w:color w:val="111827"/>
+        </w:rPr>
+        <w:t xml:space="preserve"> contra </w:t>
+      </w:r>
+      <w:proofErr w:type="spellStart"/>
+      <w:r>
+        <w:rPr>
+          <w:color w:val="111827"/>
+        </w:rPr>
+        <w:t>clickjacking</w:t>
+      </w:r>
+      <w:proofErr w:type="spellEnd"/>
+      <w:r>
+        <w:rPr>
+          <w:color w:val="111827"/>
+        </w:rPr>
+        <w:t xml:space="preserve">, MIME </w:t>
+      </w:r>
+      <w:proofErr w:type="spellStart"/>
+      <w:r>
+        <w:rPr>
+          <w:color w:val="111827"/>
+        </w:rPr>
+        <w:t>sniffing</w:t>
+      </w:r>
+      <w:proofErr w:type="spellEnd"/>
+      <w:r>
+        <w:rPr>
+          <w:color w:val="111827"/>
+        </w:rPr>
+        <w:t>, XSS y otros ataques de capa de transporte</w:t>
+      </w:r>
+    </w:p>
+    <w:p>
+      <w:pPr>
+        <w:pStyle w:val="Prrafodelista"/>
+        <w:numPr>
+          <w:ilvl w:val="0"/>
+          <w:numId w:val="2"/>
+        </w:numPr>
+        <w:spacing w:before="50" w:after="50"/>
+      </w:pPr>
+      <w:r>
+        <w:rPr>
+          <w:color w:val="111827"/>
+        </w:rPr>
+        <w:t xml:space="preserve">Rate </w:t>
+      </w:r>
+      <w:proofErr w:type="spellStart"/>
+      <w:r>
+        <w:rPr>
+          <w:color w:val="111827"/>
+        </w:rPr>
+        <w:t>limiting</w:t>
+      </w:r>
+      <w:proofErr w:type="spellEnd"/>
+      <w:r>
+        <w:rPr>
+          <w:color w:val="111827"/>
+        </w:rPr>
+        <w:t xml:space="preserve"> por IP en todos los </w:t>
+      </w:r>
+      <w:proofErr w:type="spellStart"/>
+      <w:r>
+        <w:rPr>
+          <w:color w:val="111827"/>
+        </w:rPr>
+        <w:t>endpoints</w:t>
+      </w:r>
+      <w:proofErr w:type="spellEnd"/>
+      <w:r>
+        <w:rPr>
+          <w:color w:val="111827"/>
+        </w:rPr>
+        <w:t xml:space="preserve"> de </w:t>
+      </w:r>
+      <w:proofErr w:type="spellStart"/>
+      <w:r>
+        <w:rPr>
+          <w:color w:val="111827"/>
+        </w:rPr>
+        <w:t>autenticacion</w:t>
+      </w:r>
+      <w:proofErr w:type="spellEnd"/>
+      <w:r>
+        <w:rPr>
+          <w:color w:val="111827"/>
+        </w:rPr>
+        <w:t xml:space="preserve">: previene fuerza bruta en </w:t>
+      </w:r>
+      <w:proofErr w:type="spellStart"/>
+      <w:r>
+        <w:rPr>
+          <w:color w:val="111827"/>
+        </w:rPr>
+        <w:t>login</w:t>
+      </w:r>
+      <w:proofErr w:type="spellEnd"/>
+      <w:r>
+        <w:rPr>
+          <w:color w:val="111827"/>
+        </w:rPr>
+        <w:t xml:space="preserve">, abuso del sistema de emails y </w:t>
+      </w:r>
+      <w:proofErr w:type="spellStart"/>
+      <w:r>
+        <w:rPr>
+          <w:color w:val="111827"/>
+        </w:rPr>
+        <w:t>enumeracion</w:t>
+      </w:r>
+      <w:proofErr w:type="spellEnd"/>
+      <w:r>
+        <w:rPr>
+          <w:color w:val="111827"/>
+        </w:rPr>
+        <w:t xml:space="preserve"> de usuarios</w:t>
+      </w:r>
+    </w:p>
+    <w:p>
+      <w:pPr>
+        <w:pStyle w:val="Prrafodelista"/>
+        <w:numPr>
+          <w:ilvl w:val="0"/>
+          <w:numId w:val="2"/>
+        </w:numPr>
+        <w:spacing w:before="50" w:after="50"/>
+      </w:pPr>
+      <w:r>
+        <w:rPr>
+          <w:color w:val="111827"/>
+        </w:rPr>
+        <w:t xml:space="preserve">Campos sensibles (hash de </w:t>
+      </w:r>
+      <w:proofErr w:type="spellStart"/>
+      <w:r>
+        <w:rPr>
+          <w:color w:val="111827"/>
+        </w:rPr>
+        <w:t>contrasena</w:t>
+      </w:r>
+      <w:proofErr w:type="spellEnd"/>
+      <w:r>
+        <w:rPr>
+          <w:color w:val="111827"/>
+        </w:rPr>
+        <w:t xml:space="preserve">, tokens de </w:t>
+      </w:r>
+      <w:proofErr w:type="spellStart"/>
+      <w:r>
+        <w:rPr>
+          <w:color w:val="111827"/>
+        </w:rPr>
+        <w:t>recuperacion</w:t>
+      </w:r>
+      <w:proofErr w:type="spellEnd"/>
+      <w:r>
+        <w:rPr>
+          <w:color w:val="111827"/>
+        </w:rPr>
+        <w:t>) excluidos de todas las respuestas de la API</w:t>
+      </w:r>
+    </w:p>
+    <w:p>
+      <w:pPr>
+        <w:pStyle w:val="Prrafodelista"/>
+        <w:numPr>
+          <w:ilvl w:val="0"/>
+          <w:numId w:val="2"/>
+        </w:numPr>
+        <w:spacing w:before="50" w:after="50"/>
+      </w:pPr>
+      <w:r>
+        <w:rPr>
+          <w:color w:val="111827"/>
+        </w:rPr>
+        <w:t xml:space="preserve">Mensajes de error </w:t>
+      </w:r>
+      <w:proofErr w:type="spellStart"/>
+      <w:r>
+        <w:rPr>
+          <w:color w:val="111827"/>
+        </w:rPr>
+        <w:t>genericos</w:t>
+      </w:r>
+      <w:proofErr w:type="spellEnd"/>
+      <w:r>
+        <w:rPr>
+          <w:color w:val="111827"/>
+        </w:rPr>
+        <w:t xml:space="preserve"> al cliente: </w:t>
+      </w:r>
+      <w:proofErr w:type="spellStart"/>
+      <w:r>
+        <w:rPr>
+          <w:color w:val="111827"/>
+        </w:rPr>
+        <w:t>ningun</w:t>
+      </w:r>
+      <w:proofErr w:type="spellEnd"/>
+      <w:r>
+        <w:rPr>
+          <w:color w:val="111827"/>
+        </w:rPr>
+        <w:t xml:space="preserve"> detalle interno del servidor se expone en </w:t>
+      </w:r>
+      <w:proofErr w:type="spellStart"/>
+      <w:r>
+        <w:rPr>
+          <w:color w:val="111827"/>
+        </w:rPr>
+        <w:t>produccion</w:t>
+      </w:r>
+      <w:proofErr w:type="spellEnd"/>
+    </w:p>
+    <w:p>
+      <w:pPr>
+        <w:pStyle w:val="Prrafodelista"/>
+        <w:numPr>
+          <w:ilvl w:val="0"/>
+          <w:numId w:val="2"/>
+        </w:numPr>
+        <w:spacing w:before="50" w:after="50"/>
+      </w:pPr>
+      <w:proofErr w:type="spellStart"/>
+      <w:r>
+        <w:rPr>
+          <w:color w:val="111827"/>
+        </w:rPr>
+        <w:t>Validacion</w:t>
+      </w:r>
+      <w:proofErr w:type="spellEnd"/>
+      <w:r>
+        <w:rPr>
+          <w:color w:val="111827"/>
+        </w:rPr>
+        <w:t xml:space="preserve"> de formato de correo y longitudes </w:t>
+      </w:r>
+      <w:proofErr w:type="spellStart"/>
+      <w:r>
+        <w:rPr>
+          <w:color w:val="111827"/>
+        </w:rPr>
+        <w:t>maximas</w:t>
+      </w:r>
+      <w:proofErr w:type="spellEnd"/>
+      <w:r>
+        <w:rPr>
+          <w:color w:val="111827"/>
+        </w:rPr>
+        <w:t xml:space="preserve"> en todos los </w:t>
+      </w:r>
+      <w:proofErr w:type="spellStart"/>
+      <w:r>
+        <w:rPr>
+          <w:color w:val="111827"/>
+        </w:rPr>
+        <w:t>endpoints</w:t>
+      </w:r>
+      <w:proofErr w:type="spellEnd"/>
+      <w:r>
+        <w:rPr>
+          <w:color w:val="111827"/>
+        </w:rPr>
+        <w:t xml:space="preserve"> de entrada de datos</w:t>
+      </w:r>
+    </w:p>
+    <w:p>
+      <w:pPr>
+        <w:pStyle w:val="Prrafodelista"/>
+        <w:numPr>
+          <w:ilvl w:val="0"/>
+          <w:numId w:val="2"/>
+        </w:numPr>
+        <w:spacing w:before="50" w:after="50"/>
+      </w:pPr>
+      <w:proofErr w:type="spellStart"/>
+      <w:r>
+        <w:rPr>
+          <w:color w:val="111827"/>
+        </w:rPr>
+        <w:t>Proteccion</w:t>
+      </w:r>
+      <w:proofErr w:type="spellEnd"/>
+      <w:r>
+        <w:rPr>
+          <w:color w:val="111827"/>
+        </w:rPr>
+        <w:t xml:space="preserve"> contra </w:t>
+      </w:r>
+      <w:proofErr w:type="spellStart"/>
+      <w:r>
+        <w:rPr>
+          <w:color w:val="111827"/>
+        </w:rPr>
+        <w:t>enumeracion</w:t>
+      </w:r>
+      <w:proofErr w:type="spellEnd"/>
+      <w:r>
+        <w:rPr>
+          <w:color w:val="111827"/>
+        </w:rPr>
+        <w:t xml:space="preserve"> de usuarios en </w:t>
+      </w:r>
+      <w:proofErr w:type="spellStart"/>
+      <w:r>
+        <w:rPr>
+          <w:color w:val="111827"/>
+        </w:rPr>
+        <w:t>recuperacion</w:t>
+      </w:r>
+      <w:proofErr w:type="spellEnd"/>
+      <w:r>
+        <w:rPr>
+          <w:color w:val="111827"/>
+        </w:rPr>
+        <w:t xml:space="preserve"> de </w:t>
+      </w:r>
+      <w:proofErr w:type="spellStart"/>
+      <w:r>
+        <w:rPr>
+          <w:color w:val="111827"/>
+        </w:rPr>
+        <w:t>contrasena</w:t>
+      </w:r>
+      <w:proofErr w:type="spellEnd"/>
+    </w:p>
+    <w:p>
+      <w:pPr>
+        <w:spacing w:before="80"/>
+      </w:pPr>
+    </w:p>
+    <w:p>
+      <w:pPr>
+        <w:pStyle w:val="Ttulo2"/>
+      </w:pPr>
+      <w:r>
+        <w:t>3.3 Emails sin restricciones a cualquier correo</w:t>
+      </w:r>
+    </w:p>
+    <w:p>
+      <w:pPr>
+        <w:spacing w:before="60" w:after="80"/>
+      </w:pPr>
+      <w:r>
+        <w:rPr>
+          <w:color w:val="111827"/>
+        </w:rPr>
         <w:t xml:space="preserve">El sistema usa Gmail </w:t>
       </w:r>
       <w:proofErr w:type="spellStart"/>
@@ -1210,7 +1803,35 @@
         <w:rPr>
           <w:color w:val="111827"/>
         </w:rPr>
-        <w:t xml:space="preserve"> SMTP con Nodemailer, lo que permite enviar notificaciones a cualquier correo del mundo (Gmail, Outlook, Hotmail, </w:t>
+        <w:t xml:space="preserve"> SMTP con </w:t>
+      </w:r>
+      <w:proofErr w:type="spellStart"/>
+      <w:r>
+        <w:rPr>
+          <w:color w:val="111827"/>
+        </w:rPr>
+        <w:t>Nodemailer</w:t>
+      </w:r>
+      <w:proofErr w:type="spellEnd"/>
+      <w:r>
+        <w:rPr>
+          <w:color w:val="111827"/>
+        </w:rPr>
+        <w:t xml:space="preserve"> sobre el plan Starter de Render, que desbloquea los puertos SMTP. Esto permite enviar notificaciones a cualquier correo del mundo sin </w:t>
+      </w:r>
+      <w:proofErr w:type="spellStart"/>
+      <w:r>
+        <w:rPr>
+          <w:color w:val="111827"/>
+        </w:rPr>
+        <w:t>restriccion</w:t>
+      </w:r>
+      <w:proofErr w:type="spellEnd"/>
+      <w:r>
+        <w:rPr>
+          <w:color w:val="111827"/>
+        </w:rPr>
+        <w:t xml:space="preserve"> de dominio ni de destinatario: Gmail, Outlook, Hotmail, </w:t>
       </w:r>
       <w:proofErr w:type="spellStart"/>
       <w:r>
@@ -1224,21 +1845,7 @@
         <w:rPr>
           <w:color w:val="111827"/>
         </w:rPr>
-        <w:t xml:space="preserve">, correos corporativos, etc.) sin </w:t>
-      </w:r>
-      <w:proofErr w:type="spellStart"/>
-      <w:r>
-        <w:rPr>
-          <w:color w:val="111827"/>
-        </w:rPr>
-        <w:t>restriccion</w:t>
-      </w:r>
-      <w:proofErr w:type="spellEnd"/>
-      <w:r>
-        <w:rPr>
-          <w:color w:val="111827"/>
-        </w:rPr>
-        <w:t xml:space="preserve"> de dominio ni de destinatario. Esto es posible gracias al plan Starter de Render que desbloquea los puertos SMTP.</w:t>
+        <w:t>, correos corporativos y cualquier proveedor de email.</w:t>
       </w:r>
     </w:p>
     <w:p>
@@ -1251,7 +1858,7 @@
         <w:pStyle w:val="Ttulo2"/>
       </w:pPr>
       <w:r>
-        <w:t xml:space="preserve">3.3 Costo de </w:t>
+        <w:t xml:space="preserve">3.4 Costo de </w:t>
       </w:r>
       <w:proofErr w:type="spellStart"/>
       <w:r>
@@ -1282,7 +1889,7 @@
           <w:left w:w="10" w:type="dxa"/>
           <w:right w:w="10" w:type="dxa"/>
         </w:tblCellMar>
-        <w:tblLook w:val="04A0" w:firstRow="1" w:lastRow="0" w:firstColumn="1" w:lastColumn="0" w:noHBand="0" w:noVBand="1"/>
+        <w:tblLook w:val="0000" w:firstRow="0" w:lastRow="0" w:firstColumn="0" w:lastColumn="0" w:noHBand="0" w:noVBand="0"/>
       </w:tblPr>
       <w:tblGrid>
         <w:gridCol w:w="3000"/>
@@ -1290,6 +1897,12 @@
         <w:gridCol w:w="5160"/>
       </w:tblGrid>
       <w:tr>
+        <w:tblPrEx>
+          <w:tblCellMar>
+            <w:top w:w="0" w:type="dxa"/>
+            <w:bottom w:w="0" w:type="dxa"/>
+          </w:tblCellMar>
+        </w:tblPrEx>
         <w:tc>
           <w:tcPr>
             <w:tcW w:w="3000" w:type="dxa"/>
@@ -1382,6 +1995,12 @@
         </w:tc>
       </w:tr>
       <w:tr>
+        <w:tblPrEx>
+          <w:tblCellMar>
+            <w:top w:w="0" w:type="dxa"/>
+            <w:bottom w:w="0" w:type="dxa"/>
+          </w:tblCellMar>
+        </w:tblPrEx>
         <w:tc>
           <w:tcPr>
             <w:tcW w:w="3000" w:type="dxa"/>
@@ -1462,12 +2081,18 @@
                 <w:sz w:val="20"/>
                 <w:szCs w:val="20"/>
               </w:rPr>
-              <w:t>Servidor 24/7, puertos SMTP, redespliegues ilimitados</w:t>
+              <w:t>Servidor 24/7, SMTP desbloqueado, redespliegues ilimitados</w:t>
             </w:r>
           </w:p>
         </w:tc>
       </w:tr>
       <w:tr>
+        <w:tblPrEx>
+          <w:tblCellMar>
+            <w:top w:w="0" w:type="dxa"/>
+            <w:bottom w:w="0" w:type="dxa"/>
+          </w:tblCellMar>
+        </w:tblPrEx>
         <w:tc>
           <w:tcPr>
             <w:tcW w:w="3000" w:type="dxa"/>
@@ -1554,6 +2179,12 @@
         </w:tc>
       </w:tr>
       <w:tr>
+        <w:tblPrEx>
+          <w:tblCellMar>
+            <w:top w:w="0" w:type="dxa"/>
+            <w:bottom w:w="0" w:type="dxa"/>
+          </w:tblCellMar>
+        </w:tblPrEx>
         <w:tc>
           <w:tcPr>
             <w:tcW w:w="3000" w:type="dxa"/>
@@ -1650,6 +2281,12 @@
         </w:tc>
       </w:tr>
       <w:tr>
+        <w:tblPrEx>
+          <w:tblCellMar>
+            <w:top w:w="0" w:type="dxa"/>
+            <w:bottom w:w="0" w:type="dxa"/>
+          </w:tblCellMar>
+        </w:tblPrEx>
         <w:tc>
           <w:tcPr>
             <w:tcW w:w="3000" w:type="dxa"/>
@@ -1764,6 +2401,12 @@
         </w:tc>
       </w:tr>
       <w:tr>
+        <w:tblPrEx>
+          <w:tblCellMar>
+            <w:top w:w="0" w:type="dxa"/>
+            <w:bottom w:w="0" w:type="dxa"/>
+          </w:tblCellMar>
+        </w:tblPrEx>
         <w:tc>
           <w:tcPr>
             <w:tcW w:w="3000" w:type="dxa"/>
@@ -1789,6 +2432,7 @@
                 <w:sz w:val="20"/>
                 <w:szCs w:val="20"/>
               </w:rPr>
+              <w:lastRenderedPageBreak/>
               <w:t>Groq</w:t>
             </w:r>
             <w:proofErr w:type="spellEnd"/>
@@ -1888,6 +2532,12 @@
         </w:tc>
       </w:tr>
       <w:tr>
+        <w:tblPrEx>
+          <w:tblCellMar>
+            <w:top w:w="0" w:type="dxa"/>
+            <w:bottom w:w="0" w:type="dxa"/>
+          </w:tblCellMar>
+        </w:tblPrEx>
         <w:tc>
           <w:tcPr>
             <w:tcW w:w="3000" w:type="dxa"/>
@@ -1984,7 +2634,7 @@
                 <w:sz w:val="20"/>
                 <w:szCs w:val="20"/>
               </w:rPr>
-              <w:t xml:space="preserve"> completa con todas las funcionalidades</w:t>
+              <w:t xml:space="preserve"> completa incluyendo seguridad y IA</w:t>
             </w:r>
           </w:p>
         </w:tc>
@@ -2000,7 +2650,7 @@
         <w:pStyle w:val="Ttulo2"/>
       </w:pPr>
       <w:r>
-        <w:t xml:space="preserve">3.4 </w:t>
+        <w:t xml:space="preserve">3.5 </w:t>
       </w:r>
       <w:proofErr w:type="spellStart"/>
       <w:r>
@@ -2016,7 +2666,15 @@
       </w:r>
       <w:proofErr w:type="spellEnd"/>
       <w:r>
-        <w:t xml:space="preserve"> completa</w:t>
+        <w:t xml:space="preserve"> sin </w:t>
+      </w:r>
+      <w:proofErr w:type="spellStart"/>
+      <w:r>
+        <w:t>intervencion</w:t>
+      </w:r>
+      <w:proofErr w:type="spellEnd"/>
+      <w:r>
+        <w:t xml:space="preserve"> manual</w:t>
       </w:r>
     </w:p>
     <w:p>
@@ -2032,7 +2690,7 @@
         <w:rPr>
           <w:color w:val="111827"/>
         </w:rPr>
-        <w:t xml:space="preserve">Al registrar novedad: el usuario recibe </w:t>
+        <w:t xml:space="preserve">Al registrar novedad: </w:t>
       </w:r>
       <w:proofErr w:type="spellStart"/>
       <w:r>
@@ -2046,7 +2704,7 @@
         <w:rPr>
           <w:color w:val="111827"/>
         </w:rPr>
-        <w:t xml:space="preserve"> con tipo de solicitud, fecha y estado inicial</w:t>
+        <w:t xml:space="preserve"> inmediata con tipo, fecha y estado inicial</w:t>
       </w:r>
     </w:p>
     <w:p>
@@ -2062,7 +2720,7 @@
         <w:rPr>
           <w:color w:val="111827"/>
         </w:rPr>
-        <w:t xml:space="preserve">Al cambiar estado: el usuario recibe el resultado (aprobado/rechazado) con </w:t>
+        <w:t xml:space="preserve">Al cambiar estado: resultado con </w:t>
       </w:r>
       <w:proofErr w:type="spellStart"/>
       <w:r>
@@ -2092,7 +2750,7 @@
         <w:rPr>
           <w:color w:val="111827"/>
         </w:rPr>
-        <w:t>Al activar cuenta: email de bienvenida con enlace para ingresar al sistema</w:t>
+        <w:t>Al activar cuenta: email de bienvenida con enlace de acceso</w:t>
       </w:r>
     </w:p>
     <w:p>
@@ -2108,14 +2766,14 @@
         <w:rPr>
           <w:color w:val="111827"/>
         </w:rPr>
-        <w:t xml:space="preserve">Al solicitar </w:t>
-      </w:r>
-      <w:proofErr w:type="spellStart"/>
-      <w:r>
-        <w:rPr>
-          <w:color w:val="111827"/>
-        </w:rPr>
-        <w:t>recuperacion</w:t>
+        <w:t xml:space="preserve">Al recuperar </w:t>
+      </w:r>
+      <w:proofErr w:type="spellStart"/>
+      <w:r>
+        <w:rPr>
+          <w:color w:val="111827"/>
+        </w:rPr>
+        <w:t>contrasena</w:t>
       </w:r>
       <w:proofErr w:type="spellEnd"/>
       <w:r>
@@ -2146,10 +2804,26 @@
     </w:p>
     <w:p>
       <w:pPr>
+        <w:pBdr>
+          <w:bottom w:val="single" w:sz="3" w:space="1" w:color="EDE9FE"/>
+        </w:pBdr>
+        <w:spacing w:before="180" w:after="180"/>
+      </w:pPr>
+    </w:p>
+    <w:p>
+      <w:pPr>
+        <w:pStyle w:val="Ttulo1"/>
+      </w:pPr>
+      <w:r>
+        <w:t>4. Funcionalidades por perfil</w:t>
+      </w:r>
+    </w:p>
+    <w:p>
+      <w:pPr>
         <w:pStyle w:val="Ttulo2"/>
       </w:pPr>
       <w:r>
-        <w:t>3.5 Experiencia de usuario cuidada</w:t>
+        <w:t>4.1 Usuario</w:t>
       </w:r>
     </w:p>
     <w:p>
@@ -2165,7 +2839,35 @@
         <w:rPr>
           <w:color w:val="111827"/>
         </w:rPr>
-        <w:t>Indicadores de carga en todos los botones que hacen peticiones al servidor</w:t>
+        <w:t xml:space="preserve">Registrar solicitudes: Incapacidad </w:t>
+      </w:r>
+      <w:proofErr w:type="spellStart"/>
+      <w:r>
+        <w:rPr>
+          <w:color w:val="111827"/>
+        </w:rPr>
+        <w:t>medica</w:t>
+      </w:r>
+      <w:proofErr w:type="spellEnd"/>
+      <w:r>
+        <w:rPr>
+          <w:color w:val="111827"/>
+        </w:rPr>
+        <w:t xml:space="preserve">, Calamidad </w:t>
+      </w:r>
+      <w:proofErr w:type="spellStart"/>
+      <w:r>
+        <w:rPr>
+          <w:color w:val="111827"/>
+        </w:rPr>
+        <w:t>domestica</w:t>
+      </w:r>
+      <w:proofErr w:type="spellEnd"/>
+      <w:r>
+        <w:rPr>
+          <w:color w:val="111827"/>
+        </w:rPr>
+        <w:t>, Permiso, Constancia de entrenamiento, Solicitud de egresado</w:t>
       </w:r>
     </w:p>
     <w:p>
@@ -2181,8 +2883,30 @@
         <w:rPr>
           <w:color w:val="111827"/>
         </w:rPr>
-        <w:t>Estados de error descriptivos en lugar de pantallas en blanco</w:t>
-      </w:r>
+        <w:t xml:space="preserve">Adjuntar documento (imagen o PDF, </w:t>
+      </w:r>
+      <w:proofErr w:type="spellStart"/>
+      <w:r>
+        <w:rPr>
+          <w:color w:val="111827"/>
+        </w:rPr>
+        <w:t>max</w:t>
+      </w:r>
+      <w:proofErr w:type="spellEnd"/>
+      <w:r>
+        <w:rPr>
+          <w:color w:val="111827"/>
+        </w:rPr>
+        <w:t xml:space="preserve"> 10 MB) con drag-and-</w:t>
+      </w:r>
+      <w:proofErr w:type="spellStart"/>
+      <w:r>
+        <w:rPr>
+          <w:color w:val="111827"/>
+        </w:rPr>
+        <w:t>drop</w:t>
+      </w:r>
+      <w:proofErr w:type="spellEnd"/>
     </w:p>
     <w:p>
       <w:pPr>
@@ -2197,7 +2921,21 @@
         <w:rPr>
           <w:color w:val="111827"/>
         </w:rPr>
-        <w:t>Light Mode y Dark Mode persistente por usuario</w:t>
+        <w:t xml:space="preserve">Ver historial con estado actualizado y detalle de </w:t>
+      </w:r>
+      <w:proofErr w:type="spellStart"/>
+      <w:r>
+        <w:rPr>
+          <w:color w:val="111827"/>
+        </w:rPr>
+        <w:t>observacion</w:t>
+      </w:r>
+      <w:proofErr w:type="spellEnd"/>
+      <w:r>
+        <w:rPr>
+          <w:color w:val="111827"/>
+        </w:rPr>
+        <w:t xml:space="preserve"> del profesional</w:t>
       </w:r>
     </w:p>
     <w:p>
@@ -2213,35 +2951,21 @@
         <w:rPr>
           <w:color w:val="111827"/>
         </w:rPr>
-        <w:t xml:space="preserve">Responsive — accesible desde </w:t>
-      </w:r>
-      <w:proofErr w:type="spellStart"/>
-      <w:r>
-        <w:rPr>
-          <w:color w:val="111827"/>
-        </w:rPr>
-        <w:t>movil</w:t>
-      </w:r>
-      <w:proofErr w:type="spellEnd"/>
-      <w:r>
-        <w:rPr>
-          <w:color w:val="111827"/>
-        </w:rPr>
-        <w:t xml:space="preserve">, </w:t>
-      </w:r>
-      <w:proofErr w:type="spellStart"/>
-      <w:r>
-        <w:rPr>
-          <w:color w:val="111827"/>
-        </w:rPr>
-        <w:t>tablet</w:t>
-      </w:r>
-      <w:proofErr w:type="spellEnd"/>
-      <w:r>
-        <w:rPr>
-          <w:color w:val="111827"/>
-        </w:rPr>
-        <w:t xml:space="preserve"> y escritorio</w:t>
+        <w:t xml:space="preserve">Recibir email </w:t>
+      </w:r>
+      <w:proofErr w:type="spellStart"/>
+      <w:r>
+        <w:rPr>
+          <w:color w:val="111827"/>
+        </w:rPr>
+        <w:t>automatico</w:t>
+      </w:r>
+      <w:proofErr w:type="spellEnd"/>
+      <w:r>
+        <w:rPr>
+          <w:color w:val="111827"/>
+        </w:rPr>
+        <w:t xml:space="preserve"> en cada cambio de estado</w:t>
       </w:r>
     </w:p>
     <w:p>
@@ -2258,28 +2982,28 @@
         <w:rPr>
           <w:color w:val="111827"/>
         </w:rPr>
-        <w:t>Badges</w:t>
-      </w:r>
-      <w:proofErr w:type="spellEnd"/>
-      <w:r>
-        <w:rPr>
-          <w:color w:val="111827"/>
-        </w:rPr>
-        <w:t xml:space="preserve"> </w:t>
-      </w:r>
-      <w:proofErr w:type="spellStart"/>
-      <w:r>
-        <w:rPr>
-          <w:color w:val="111827"/>
-        </w:rPr>
-        <w:t>numericos</w:t>
-      </w:r>
-      <w:proofErr w:type="spellEnd"/>
-      <w:r>
-        <w:rPr>
-          <w:color w:val="111827"/>
-        </w:rPr>
-        <w:t xml:space="preserve"> de novedades pendientes y usuarios inactivos en la barra lateral</w:t>
+        <w:t>Recuperacion</w:t>
+      </w:r>
+      <w:proofErr w:type="spellEnd"/>
+      <w:r>
+        <w:rPr>
+          <w:color w:val="111827"/>
+        </w:rPr>
+        <w:t xml:space="preserve"> de </w:t>
+      </w:r>
+      <w:proofErr w:type="spellStart"/>
+      <w:r>
+        <w:rPr>
+          <w:color w:val="111827"/>
+        </w:rPr>
+        <w:t>contrasena</w:t>
+      </w:r>
+      <w:proofErr w:type="spellEnd"/>
+      <w:r>
+        <w:rPr>
+          <w:color w:val="111827"/>
+        </w:rPr>
+        <w:t xml:space="preserve"> con enlace seguro</w:t>
       </w:r>
     </w:p>
     <w:p>
@@ -2289,27 +3013,10 @@
     </w:p>
     <w:p>
       <w:pPr>
-        <w:pBdr>
-          <w:bottom w:val="single" w:sz="3" w:space="1" w:color="EDE9FE"/>
-        </w:pBdr>
-        <w:spacing w:before="180" w:after="180"/>
-      </w:pPr>
-    </w:p>
-    <w:p>
-      <w:pPr>
-        <w:pStyle w:val="Ttulo1"/>
-      </w:pPr>
-      <w:r>
-        <w:lastRenderedPageBreak/>
-        <w:t>4. Funcionalidades por perfil</w:t>
-      </w:r>
-    </w:p>
-    <w:p>
-      <w:pPr>
         <w:pStyle w:val="Ttulo2"/>
       </w:pPr>
       <w:r>
-        <w:t>4.1 Usuario</w:t>
+        <w:t>4.2 Administrador</w:t>
       </w:r>
     </w:p>
     <w:p>
@@ -2321,39 +3028,33 @@
         </w:numPr>
         <w:spacing w:before="50" w:after="50"/>
       </w:pPr>
-      <w:r>
-        <w:rPr>
-          <w:color w:val="111827"/>
-        </w:rPr>
-        <w:t xml:space="preserve">Registrar solicitudes: Incapacidad </w:t>
-      </w:r>
-      <w:proofErr w:type="spellStart"/>
-      <w:r>
-        <w:rPr>
-          <w:color w:val="111827"/>
-        </w:rPr>
-        <w:t>medica</w:t>
-      </w:r>
-      <w:proofErr w:type="spellEnd"/>
-      <w:r>
-        <w:rPr>
-          <w:color w:val="111827"/>
-        </w:rPr>
-        <w:t xml:space="preserve">, Calamidad </w:t>
-      </w:r>
-      <w:proofErr w:type="spellStart"/>
-      <w:r>
-        <w:rPr>
-          <w:color w:val="111827"/>
-        </w:rPr>
-        <w:t>domestica</w:t>
-      </w:r>
-      <w:proofErr w:type="spellEnd"/>
-      <w:r>
-        <w:rPr>
-          <w:color w:val="111827"/>
-        </w:rPr>
-        <w:t>, Permiso, Constancia de entrenamiento, Solicitud de egresado</w:t>
+      <w:proofErr w:type="spellStart"/>
+      <w:r>
+        <w:rPr>
+          <w:color w:val="111827"/>
+        </w:rPr>
+        <w:t>Dashboard</w:t>
+      </w:r>
+      <w:proofErr w:type="spellEnd"/>
+      <w:r>
+        <w:rPr>
+          <w:color w:val="111827"/>
+        </w:rPr>
+        <w:t xml:space="preserve"> con </w:t>
+      </w:r>
+      <w:proofErr w:type="spellStart"/>
+      <w:r>
+        <w:rPr>
+          <w:color w:val="111827"/>
+        </w:rPr>
+        <w:t>estadisticas</w:t>
+      </w:r>
+      <w:proofErr w:type="spellEnd"/>
+      <w:r>
+        <w:rPr>
+          <w:color w:val="111827"/>
+        </w:rPr>
+        <w:t xml:space="preserve"> en tiempo real (total, pendientes, aprobadas, rechazadas)</w:t>
       </w:r>
     </w:p>
     <w:p>
@@ -2369,30 +3070,36 @@
         <w:rPr>
           <w:color w:val="111827"/>
         </w:rPr>
-        <w:t xml:space="preserve">Adjuntar documento de soporte (imagen o PDF, </w:t>
-      </w:r>
-      <w:proofErr w:type="spellStart"/>
-      <w:r>
-        <w:rPr>
-          <w:color w:val="111827"/>
-        </w:rPr>
-        <w:t>maximo</w:t>
-      </w:r>
-      <w:proofErr w:type="spellEnd"/>
-      <w:r>
-        <w:rPr>
-          <w:color w:val="111827"/>
-        </w:rPr>
-        <w:t xml:space="preserve"> 10 MB) con drag-and-</w:t>
-      </w:r>
-      <w:proofErr w:type="spellStart"/>
-      <w:r>
-        <w:rPr>
-          <w:color w:val="111827"/>
-        </w:rPr>
-        <w:t>drop</w:t>
-      </w:r>
-      <w:proofErr w:type="spellEnd"/>
+        <w:t xml:space="preserve">Filtros por estado y </w:t>
+      </w:r>
+      <w:proofErr w:type="spellStart"/>
+      <w:r>
+        <w:rPr>
+          <w:color w:val="111827"/>
+        </w:rPr>
+        <w:t>busqueda</w:t>
+      </w:r>
+      <w:proofErr w:type="spellEnd"/>
+      <w:r>
+        <w:rPr>
+          <w:color w:val="111827"/>
+        </w:rPr>
+        <w:t xml:space="preserve"> full-</w:t>
+      </w:r>
+      <w:proofErr w:type="spellStart"/>
+      <w:r>
+        <w:rPr>
+          <w:color w:val="111827"/>
+        </w:rPr>
+        <w:t>text</w:t>
+      </w:r>
+      <w:proofErr w:type="spellEnd"/>
+      <w:r>
+        <w:rPr>
+          <w:color w:val="111827"/>
+        </w:rPr>
+        <w:t xml:space="preserve"> en nombre, correo, documento o tipo</w:t>
+      </w:r>
     </w:p>
     <w:p>
       <w:pPr>
@@ -2407,7 +3114,7 @@
         <w:rPr>
           <w:color w:val="111827"/>
         </w:rPr>
-        <w:t>Ver historial de solicitudes con estado actualizado en tiempo real</w:t>
+        <w:t>Ver detalle completo con adjunto y prioridad asignada por IA</w:t>
       </w:r>
     </w:p>
     <w:p>
@@ -2423,7 +3130,7 @@
         <w:rPr>
           <w:color w:val="111827"/>
         </w:rPr>
-        <w:t xml:space="preserve">Ver detalle de cada solicitud con la </w:t>
+        <w:t xml:space="preserve">Aprobar/rechazar con </w:t>
       </w:r>
       <w:proofErr w:type="spellStart"/>
       <w:r>
@@ -2437,7 +3144,35 @@
         <w:rPr>
           <w:color w:val="111827"/>
         </w:rPr>
-        <w:t xml:space="preserve"> del profesional</w:t>
+        <w:t xml:space="preserve"> y </w:t>
+      </w:r>
+      <w:proofErr w:type="spellStart"/>
+      <w:r>
+        <w:rPr>
+          <w:color w:val="111827"/>
+        </w:rPr>
+        <w:t>notificacion</w:t>
+      </w:r>
+      <w:proofErr w:type="spellEnd"/>
+      <w:r>
+        <w:rPr>
+          <w:color w:val="111827"/>
+        </w:rPr>
+        <w:t xml:space="preserve"> </w:t>
+      </w:r>
+      <w:proofErr w:type="spellStart"/>
+      <w:r>
+        <w:rPr>
+          <w:color w:val="111827"/>
+        </w:rPr>
+        <w:t>automatica</w:t>
+      </w:r>
+      <w:proofErr w:type="spellEnd"/>
+      <w:r>
+        <w:rPr>
+          <w:color w:val="111827"/>
+        </w:rPr>
+        <w:t xml:space="preserve"> al usuario</w:t>
       </w:r>
     </w:p>
     <w:p>
@@ -2449,25 +3184,47 @@
         </w:numPr>
         <w:spacing w:before="50" w:after="50"/>
       </w:pPr>
-      <w:r>
-        <w:rPr>
-          <w:color w:val="111827"/>
-        </w:rPr>
-        <w:t xml:space="preserve">Recibir email </w:t>
-      </w:r>
-      <w:proofErr w:type="spellStart"/>
-      <w:r>
-        <w:rPr>
-          <w:color w:val="111827"/>
-        </w:rPr>
-        <w:t>automatico</w:t>
-      </w:r>
-      <w:proofErr w:type="spellEnd"/>
-      <w:r>
-        <w:rPr>
-          <w:color w:val="111827"/>
-        </w:rPr>
-        <w:t xml:space="preserve"> en cada cambio de estado</w:t>
+      <w:proofErr w:type="spellStart"/>
+      <w:r>
+        <w:rPr>
+          <w:color w:val="111827"/>
+        </w:rPr>
+        <w:t>Analisis</w:t>
+      </w:r>
+      <w:proofErr w:type="spellEnd"/>
+      <w:r>
+        <w:rPr>
+          <w:color w:val="111827"/>
+        </w:rPr>
+        <w:t xml:space="preserve"> IA bajo demanda: </w:t>
+      </w:r>
+      <w:proofErr w:type="spellStart"/>
+      <w:r>
+        <w:rPr>
+          <w:color w:val="111827"/>
+        </w:rPr>
+        <w:t>recomendacion</w:t>
+      </w:r>
+      <w:proofErr w:type="spellEnd"/>
+      <w:r>
+        <w:rPr>
+          <w:color w:val="111827"/>
+        </w:rPr>
+        <w:t xml:space="preserve">, confianza, retroactividad, historial, </w:t>
+      </w:r>
+      <w:proofErr w:type="spellStart"/>
+      <w:r>
+        <w:rPr>
+          <w:color w:val="111827"/>
+        </w:rPr>
+        <w:t>observacion</w:t>
+      </w:r>
+      <w:proofErr w:type="spellEnd"/>
+      <w:r>
+        <w:rPr>
+          <w:color w:val="111827"/>
+        </w:rPr>
+        <w:t xml:space="preserve"> sugerida</w:t>
       </w:r>
     </w:p>
     <w:p>
@@ -2479,46 +3236,25 @@
         </w:numPr>
         <w:spacing w:before="50" w:after="50"/>
       </w:pPr>
-      <w:proofErr w:type="spellStart"/>
-      <w:r>
-        <w:rPr>
-          <w:color w:val="111827"/>
-        </w:rPr>
-        <w:t>Recuperacion</w:t>
-      </w:r>
-      <w:proofErr w:type="spellEnd"/>
-      <w:r>
-        <w:rPr>
-          <w:color w:val="111827"/>
-        </w:rPr>
-        <w:t xml:space="preserve"> de </w:t>
-      </w:r>
-      <w:proofErr w:type="spellStart"/>
-      <w:r>
-        <w:rPr>
-          <w:color w:val="111827"/>
-        </w:rPr>
-        <w:t>contrasena</w:t>
-      </w:r>
-      <w:proofErr w:type="spellEnd"/>
-      <w:r>
-        <w:rPr>
-          <w:color w:val="111827"/>
-        </w:rPr>
-        <w:t xml:space="preserve"> con enlace seguro por email</w:t>
-      </w:r>
-    </w:p>
-    <w:p>
-      <w:pPr>
-        <w:spacing w:before="80"/>
-      </w:pPr>
-    </w:p>
-    <w:p>
-      <w:pPr>
-        <w:pStyle w:val="Ttulo2"/>
-      </w:pPr>
-      <w:r>
-        <w:t>4.2 Administrador</w:t>
+      <w:r>
+        <w:rPr>
+          <w:color w:val="111827"/>
+        </w:rPr>
+        <w:t xml:space="preserve">CRUD completo de usuarios con </w:t>
+      </w:r>
+      <w:proofErr w:type="spellStart"/>
+      <w:r>
+        <w:rPr>
+          <w:color w:val="111827"/>
+        </w:rPr>
+        <w:t>validacion</w:t>
+      </w:r>
+      <w:proofErr w:type="spellEnd"/>
+      <w:r>
+        <w:rPr>
+          <w:color w:val="111827"/>
+        </w:rPr>
+        <w:t xml:space="preserve"> de correo y seguridad mejorada</w:t>
       </w:r>
     </w:p>
     <w:p>
@@ -2535,28 +3271,28 @@
         <w:rPr>
           <w:color w:val="111827"/>
         </w:rPr>
-        <w:t>Dashboard</w:t>
-      </w:r>
-      <w:proofErr w:type="spellEnd"/>
-      <w:r>
-        <w:rPr>
-          <w:color w:val="111827"/>
-        </w:rPr>
-        <w:t xml:space="preserve"> con </w:t>
-      </w:r>
-      <w:proofErr w:type="spellStart"/>
-      <w:r>
-        <w:rPr>
-          <w:color w:val="111827"/>
-        </w:rPr>
-        <w:t>estadisticas</w:t>
-      </w:r>
-      <w:proofErr w:type="spellEnd"/>
-      <w:r>
-        <w:rPr>
-          <w:color w:val="111827"/>
-        </w:rPr>
-        <w:t xml:space="preserve"> en tiempo real (total/pendientes/aprobadas/rechazadas)</w:t>
+        <w:t>Importacion</w:t>
+      </w:r>
+      <w:proofErr w:type="spellEnd"/>
+      <w:r>
+        <w:rPr>
+          <w:color w:val="111827"/>
+        </w:rPr>
+        <w:t xml:space="preserve"> masiva CSV con </w:t>
+      </w:r>
+      <w:proofErr w:type="spellStart"/>
+      <w:r>
+        <w:rPr>
+          <w:color w:val="111827"/>
+        </w:rPr>
+        <w:t>validacion</w:t>
+      </w:r>
+      <w:proofErr w:type="spellEnd"/>
+      <w:r>
+        <w:rPr>
+          <w:color w:val="111827"/>
+        </w:rPr>
+        <w:t xml:space="preserve"> de formato de correo por fila</w:t>
       </w:r>
     </w:p>
     <w:p>
@@ -2572,22 +3308,30 @@
         <w:rPr>
           <w:color w:val="111827"/>
         </w:rPr>
-        <w:t xml:space="preserve">Listado con filtros por estado y </w:t>
-      </w:r>
-      <w:proofErr w:type="spellStart"/>
-      <w:r>
-        <w:rPr>
-          <w:color w:val="111827"/>
-        </w:rPr>
-        <w:t>busqueda</w:t>
-      </w:r>
-      <w:proofErr w:type="spellEnd"/>
-      <w:r>
-        <w:rPr>
-          <w:color w:val="111827"/>
-        </w:rPr>
-        <w:t xml:space="preserve"> por nombre, correo, documento o tipo</w:t>
-      </w:r>
+        <w:t xml:space="preserve">CRUD de clanes y cohortes con </w:t>
+      </w:r>
+      <w:proofErr w:type="spellStart"/>
+      <w:r>
+        <w:rPr>
+          <w:color w:val="111827"/>
+        </w:rPr>
+        <w:t>edicion</w:t>
+      </w:r>
+      <w:proofErr w:type="spellEnd"/>
+      <w:r>
+        <w:rPr>
+          <w:color w:val="111827"/>
+        </w:rPr>
+        <w:t xml:space="preserve"> </w:t>
+      </w:r>
+      <w:proofErr w:type="spellStart"/>
+      <w:r>
+        <w:rPr>
+          <w:color w:val="111827"/>
+        </w:rPr>
+        <w:t>inline</w:t>
+      </w:r>
+      <w:proofErr w:type="spellEnd"/>
     </w:p>
     <w:p>
       <w:pPr>
@@ -2602,21 +3346,53 @@
         <w:rPr>
           <w:color w:val="111827"/>
         </w:rPr>
-        <w:t xml:space="preserve">Ver detalle completo: datos del usuario, </w:t>
-      </w:r>
-      <w:proofErr w:type="spellStart"/>
-      <w:r>
-        <w:rPr>
-          <w:color w:val="111827"/>
-        </w:rPr>
-        <w:t>descripcion</w:t>
-      </w:r>
-      <w:proofErr w:type="spellEnd"/>
-      <w:r>
-        <w:rPr>
-          <w:color w:val="111827"/>
-        </w:rPr>
-        <w:t>, adjunto y prioridad IA</w:t>
+        <w:t>Historial de auditoria completo filtrable</w:t>
+      </w:r>
+    </w:p>
+    <w:p>
+      <w:pPr>
+        <w:spacing w:before="80"/>
+      </w:pPr>
+    </w:p>
+    <w:p>
+      <w:pPr>
+        <w:pBdr>
+          <w:bottom w:val="single" w:sz="3" w:space="1" w:color="EDE9FE"/>
+        </w:pBdr>
+        <w:spacing w:before="180" w:after="180"/>
+      </w:pPr>
+    </w:p>
+    <w:p>
+      <w:pPr>
+        <w:pStyle w:val="Ttulo1"/>
+      </w:pPr>
+      <w:r>
+        <w:t xml:space="preserve">5. </w:t>
+      </w:r>
+      <w:proofErr w:type="spellStart"/>
+      <w:r>
+        <w:t>Roadmap</w:t>
+      </w:r>
+      <w:proofErr w:type="spellEnd"/>
+      <w:r>
+        <w:t xml:space="preserve"> — </w:t>
+      </w:r>
+      <w:proofErr w:type="spellStart"/>
+      <w:r>
+        <w:t>Proximas</w:t>
+      </w:r>
+      <w:proofErr w:type="spellEnd"/>
+      <w:r>
+        <w:t xml:space="preserve"> versiones</w:t>
+      </w:r>
+    </w:p>
+    <w:p>
+      <w:pPr>
+        <w:pStyle w:val="Ttulo2"/>
+      </w:pPr>
+      <w:r>
+        <w:lastRenderedPageBreak/>
+        <w:t>NOVA v1.1 (planificado)</w:t>
       </w:r>
     </w:p>
     <w:p>
@@ -2632,49 +3408,35 @@
         <w:rPr>
           <w:color w:val="111827"/>
         </w:rPr>
-        <w:t xml:space="preserve">Aprobar o rechazar con campo de </w:t>
-      </w:r>
-      <w:proofErr w:type="spellStart"/>
-      <w:r>
-        <w:rPr>
-          <w:color w:val="111827"/>
-        </w:rPr>
-        <w:t>observacion</w:t>
-      </w:r>
-      <w:proofErr w:type="spellEnd"/>
-      <w:r>
-        <w:rPr>
-          <w:color w:val="111827"/>
-        </w:rPr>
-        <w:t xml:space="preserve"> y </w:t>
-      </w:r>
-      <w:proofErr w:type="spellStart"/>
-      <w:r>
-        <w:rPr>
-          <w:color w:val="111827"/>
-        </w:rPr>
-        <w:t>notificacion</w:t>
-      </w:r>
-      <w:proofErr w:type="spellEnd"/>
-      <w:r>
-        <w:rPr>
-          <w:color w:val="111827"/>
-        </w:rPr>
-        <w:t xml:space="preserve"> </w:t>
-      </w:r>
-      <w:proofErr w:type="spellStart"/>
-      <w:r>
-        <w:rPr>
-          <w:color w:val="111827"/>
-        </w:rPr>
-        <w:t>automatica</w:t>
-      </w:r>
-      <w:proofErr w:type="spellEnd"/>
-      <w:r>
-        <w:rPr>
-          <w:color w:val="111827"/>
-        </w:rPr>
-        <w:t xml:space="preserve"> al usuario</w:t>
+        <w:t xml:space="preserve">Rate </w:t>
+      </w:r>
+      <w:proofErr w:type="spellStart"/>
+      <w:r>
+        <w:rPr>
+          <w:color w:val="111827"/>
+        </w:rPr>
+        <w:t>limiting</w:t>
+      </w:r>
+      <w:proofErr w:type="spellEnd"/>
+      <w:r>
+        <w:rPr>
+          <w:color w:val="111827"/>
+        </w:rPr>
+        <w:t xml:space="preserve"> en </w:t>
+      </w:r>
+      <w:proofErr w:type="spellStart"/>
+      <w:r>
+        <w:rPr>
+          <w:color w:val="111827"/>
+        </w:rPr>
+        <w:t>endpoints</w:t>
+      </w:r>
+      <w:proofErr w:type="spellEnd"/>
+      <w:r>
+        <w:rPr>
+          <w:color w:val="111827"/>
+        </w:rPr>
+        <w:t xml:space="preserve"> de catalogo y auditoria</w:t>
       </w:r>
     </w:p>
     <w:p>
@@ -2691,42 +3453,14 @@
         <w:rPr>
           <w:color w:val="111827"/>
         </w:rPr>
-        <w:t>Analisis</w:t>
-      </w:r>
-      <w:proofErr w:type="spellEnd"/>
-      <w:r>
-        <w:rPr>
-          <w:color w:val="111827"/>
-        </w:rPr>
-        <w:t xml:space="preserve"> IA bajo demanda con </w:t>
-      </w:r>
-      <w:proofErr w:type="spellStart"/>
-      <w:r>
-        <w:rPr>
-          <w:color w:val="111827"/>
-        </w:rPr>
-        <w:t>recomendacion</w:t>
-      </w:r>
-      <w:proofErr w:type="spellEnd"/>
-      <w:r>
-        <w:rPr>
-          <w:color w:val="111827"/>
-        </w:rPr>
-        <w:t xml:space="preserve">, confianza, contexto y </w:t>
-      </w:r>
-      <w:proofErr w:type="spellStart"/>
-      <w:r>
-        <w:rPr>
-          <w:color w:val="111827"/>
-        </w:rPr>
-        <w:t>observacion</w:t>
-      </w:r>
-      <w:proofErr w:type="spellEnd"/>
-      <w:r>
-        <w:rPr>
-          <w:color w:val="111827"/>
-        </w:rPr>
-        <w:t xml:space="preserve"> sugerida</w:t>
+        <w:t>Paginacion</w:t>
+      </w:r>
+      <w:proofErr w:type="spellEnd"/>
+      <w:r>
+        <w:rPr>
+          <w:color w:val="111827"/>
+        </w:rPr>
+        <w:t xml:space="preserve"> en tablas de usuarios y novedades</w:t>
       </w:r>
     </w:p>
     <w:p>
@@ -2738,19 +3472,38 @@
         </w:numPr>
         <w:spacing w:before="50" w:after="50"/>
       </w:pPr>
-      <w:proofErr w:type="spellStart"/>
-      <w:r>
-        <w:rPr>
-          <w:color w:val="111827"/>
-        </w:rPr>
-        <w:t>Gestion</w:t>
-      </w:r>
-      <w:proofErr w:type="spellEnd"/>
-      <w:r>
-        <w:rPr>
-          <w:color w:val="111827"/>
-        </w:rPr>
-        <w:t xml:space="preserve"> completa de usuarios: crear, editar, activar, desactivar, eliminar</w:t>
+      <w:r>
+        <w:rPr>
+          <w:color w:val="111827"/>
+        </w:rPr>
+        <w:t xml:space="preserve">Panel de reportes con </w:t>
+      </w:r>
+      <w:proofErr w:type="spellStart"/>
+      <w:r>
+        <w:rPr>
+          <w:color w:val="111827"/>
+        </w:rPr>
+        <w:t>exportacion</w:t>
+      </w:r>
+      <w:proofErr w:type="spellEnd"/>
+      <w:r>
+        <w:rPr>
+          <w:color w:val="111827"/>
+        </w:rPr>
+        <w:t xml:space="preserve"> a PDF/Excel</w:t>
+      </w:r>
+    </w:p>
+    <w:p>
+      <w:pPr>
+        <w:spacing w:before="80"/>
+      </w:pPr>
+    </w:p>
+    <w:p>
+      <w:pPr>
+        <w:pStyle w:val="Ttulo2"/>
+      </w:pPr>
+      <w:r>
+        <w:t>NOVA v2.0 (planificado)</w:t>
       </w:r>
     </w:p>
     <w:p>
@@ -2762,47 +3515,25 @@
         </w:numPr>
         <w:spacing w:before="50" w:after="50"/>
       </w:pPr>
-      <w:proofErr w:type="spellStart"/>
-      <w:r>
-        <w:rPr>
-          <w:color w:val="111827"/>
-        </w:rPr>
-        <w:t>Importacion</w:t>
-      </w:r>
-      <w:proofErr w:type="spellEnd"/>
-      <w:r>
-        <w:rPr>
-          <w:color w:val="111827"/>
-        </w:rPr>
-        <w:t xml:space="preserve"> masiva </w:t>
-      </w:r>
-      <w:proofErr w:type="spellStart"/>
-      <w:r>
-        <w:rPr>
-          <w:color w:val="111827"/>
-        </w:rPr>
-        <w:t>via</w:t>
-      </w:r>
-      <w:proofErr w:type="spellEnd"/>
-      <w:r>
-        <w:rPr>
-          <w:color w:val="111827"/>
-        </w:rPr>
-        <w:t xml:space="preserve"> CSV con vista previa y </w:t>
-      </w:r>
-      <w:proofErr w:type="spellStart"/>
-      <w:r>
-        <w:rPr>
-          <w:color w:val="111827"/>
-        </w:rPr>
-        <w:t>validacion</w:t>
-      </w:r>
-      <w:proofErr w:type="spellEnd"/>
-      <w:r>
-        <w:rPr>
-          <w:color w:val="111827"/>
-        </w:rPr>
-        <w:t xml:space="preserve"> previa</w:t>
+      <w:r>
+        <w:rPr>
+          <w:color w:val="111827"/>
+        </w:rPr>
+        <w:t xml:space="preserve">Notificaciones </w:t>
+      </w:r>
+      <w:proofErr w:type="spellStart"/>
+      <w:r>
+        <w:rPr>
+          <w:color w:val="111827"/>
+        </w:rPr>
+        <w:t>push</w:t>
+      </w:r>
+      <w:proofErr w:type="spellEnd"/>
+      <w:r>
+        <w:rPr>
+          <w:color w:val="111827"/>
+        </w:rPr>
+        <w:t xml:space="preserve"> en navegador en tiempo real</w:t>
       </w:r>
     </w:p>
     <w:p>
@@ -2819,35 +3550,7 @@
         <w:rPr>
           <w:color w:val="111827"/>
         </w:rPr>
-        <w:t>Administracion</w:t>
-      </w:r>
-      <w:proofErr w:type="spellEnd"/>
-      <w:r>
-        <w:rPr>
-          <w:color w:val="111827"/>
-        </w:rPr>
-        <w:t xml:space="preserve"> de </w:t>
-      </w:r>
-      <w:proofErr w:type="spellStart"/>
-      <w:r>
-        <w:rPr>
-          <w:color w:val="111827"/>
-        </w:rPr>
-        <w:t>catalogos</w:t>
-      </w:r>
-      <w:proofErr w:type="spellEnd"/>
-      <w:r>
-        <w:rPr>
-          <w:color w:val="111827"/>
-        </w:rPr>
-        <w:t xml:space="preserve">: clanes y cohortes con </w:t>
-      </w:r>
-      <w:proofErr w:type="spellStart"/>
-      <w:r>
-        <w:rPr>
-          <w:color w:val="111827"/>
-        </w:rPr>
-        <w:t>edicion</w:t>
+        <w:t>Aplicacion</w:t>
       </w:r>
       <w:proofErr w:type="spellEnd"/>
       <w:r>
@@ -2861,9 +3564,15 @@
         <w:rPr>
           <w:color w:val="111827"/>
         </w:rPr>
-        <w:t>inline</w:t>
-      </w:r>
-      <w:proofErr w:type="spellEnd"/>
+        <w:t>movil</w:t>
+      </w:r>
+      <w:proofErr w:type="spellEnd"/>
+      <w:r>
+        <w:rPr>
+          <w:color w:val="111827"/>
+        </w:rPr>
+        <w:t xml:space="preserve"> PWA instalable en Android e iOS</w:t>
+      </w:r>
     </w:p>
     <w:p>
       <w:pPr>
@@ -2874,45 +3583,19 @@
         </w:numPr>
         <w:spacing w:before="50" w:after="50"/>
       </w:pPr>
-      <w:r>
-        <w:rPr>
-          <w:color w:val="111827"/>
-        </w:rPr>
-        <w:t>Historial de auditoria filtrable de todas las acciones del sistema</w:t>
-      </w:r>
-    </w:p>
-    <w:p>
-      <w:pPr>
-        <w:spacing w:before="80"/>
-      </w:pPr>
-    </w:p>
-    <w:p>
-      <w:pPr>
-        <w:pBdr>
-          <w:bottom w:val="single" w:sz="3" w:space="1" w:color="EDE9FE"/>
-        </w:pBdr>
-        <w:spacing w:before="180" w:after="180"/>
-      </w:pPr>
-    </w:p>
-    <w:p>
-      <w:pPr>
-        <w:pStyle w:val="Ttulo1"/>
-      </w:pPr>
-      <w:r>
-        <w:t xml:space="preserve">5. Escalabilidad y </w:t>
-      </w:r>
-      <w:proofErr w:type="spellStart"/>
-      <w:r>
-        <w:t>roadmap</w:t>
-      </w:r>
-      <w:proofErr w:type="spellEnd"/>
-    </w:p>
-    <w:p>
-      <w:pPr>
-        <w:pStyle w:val="Ttulo2"/>
-      </w:pPr>
-      <w:r>
-        <w:t>Capacidades actuales</w:t>
+      <w:proofErr w:type="spellStart"/>
+      <w:r>
+        <w:rPr>
+          <w:color w:val="111827"/>
+        </w:rPr>
+        <w:t>Multi-organizacion</w:t>
+      </w:r>
+      <w:proofErr w:type="spellEnd"/>
+      <w:r>
+        <w:rPr>
+          <w:color w:val="111827"/>
+        </w:rPr>
+        <w:t xml:space="preserve"> con aislamiento de datos por empresa</w:t>
       </w:r>
     </w:p>
     <w:p>
@@ -2924,34 +3607,34 @@
         </w:numPr>
         <w:spacing w:before="50" w:after="50"/>
       </w:pPr>
-      <w:r>
-        <w:rPr>
-          <w:color w:val="111827"/>
-        </w:rPr>
-        <w:t xml:space="preserve">Sin </w:t>
-      </w:r>
-      <w:proofErr w:type="spellStart"/>
-      <w:r>
-        <w:rPr>
-          <w:color w:val="111827"/>
-        </w:rPr>
-        <w:t>limite</w:t>
-      </w:r>
-      <w:proofErr w:type="spellEnd"/>
-      <w:r>
-        <w:rPr>
-          <w:color w:val="111827"/>
-        </w:rPr>
-        <w:t xml:space="preserve"> de usuarios — escala con el crecimiento de la </w:t>
-      </w:r>
-      <w:proofErr w:type="spellStart"/>
-      <w:r>
-        <w:rPr>
-          <w:color w:val="111827"/>
-        </w:rPr>
-        <w:t>organizacion</w:t>
-      </w:r>
-      <w:proofErr w:type="spellEnd"/>
+      <w:proofErr w:type="spellStart"/>
+      <w:r>
+        <w:rPr>
+          <w:color w:val="111827"/>
+        </w:rPr>
+        <w:t>Dashboard</w:t>
+      </w:r>
+      <w:proofErr w:type="spellEnd"/>
+      <w:r>
+        <w:rPr>
+          <w:color w:val="111827"/>
+        </w:rPr>
+        <w:t xml:space="preserve"> </w:t>
+      </w:r>
+      <w:proofErr w:type="spellStart"/>
+      <w:r>
+        <w:rPr>
+          <w:color w:val="111827"/>
+        </w:rPr>
+        <w:t>analitico</w:t>
+      </w:r>
+      <w:proofErr w:type="spellEnd"/>
+      <w:r>
+        <w:rPr>
+          <w:color w:val="111827"/>
+        </w:rPr>
+        <w:t xml:space="preserve"> con graficas de tendencias de absentismo</w:t>
+      </w:r>
     </w:p>
     <w:p>
       <w:pPr>
@@ -2967,143 +3650,6 @@
         <w:rPr>
           <w:color w:val="111827"/>
         </w:rPr>
-        <w:t>Multiples</w:t>
-      </w:r>
-      <w:proofErr w:type="spellEnd"/>
-      <w:r>
-        <w:rPr>
-          <w:color w:val="111827"/>
-        </w:rPr>
-        <w:t xml:space="preserve"> grupos (clanes) y generaciones (cohortes) simultaneas</w:t>
-      </w:r>
-    </w:p>
-    <w:p>
-      <w:pPr>
-        <w:pStyle w:val="Prrafodelista"/>
-        <w:numPr>
-          <w:ilvl w:val="0"/>
-          <w:numId w:val="2"/>
-        </w:numPr>
-        <w:spacing w:before="50" w:after="50"/>
-      </w:pPr>
-      <w:r>
-        <w:rPr>
-          <w:color w:val="111827"/>
-        </w:rPr>
-        <w:t>Arquitectura de servicios — cada componente escala independientemente</w:t>
-      </w:r>
-    </w:p>
-    <w:p>
-      <w:pPr>
-        <w:spacing w:before="80"/>
-      </w:pPr>
-    </w:p>
-    <w:p>
-      <w:pPr>
-        <w:pStyle w:val="Ttulo2"/>
-      </w:pPr>
-      <w:r>
-        <w:t>Posibles evoluciones</w:t>
-      </w:r>
-    </w:p>
-    <w:p>
-      <w:pPr>
-        <w:pStyle w:val="Prrafodelista"/>
-        <w:numPr>
-          <w:ilvl w:val="0"/>
-          <w:numId w:val="2"/>
-        </w:numPr>
-        <w:spacing w:before="50" w:after="50"/>
-      </w:pPr>
-      <w:r>
-        <w:rPr>
-          <w:color w:val="111827"/>
-        </w:rPr>
-        <w:t>Reportes exportables a PDF/Excel por rango de fechas, grupo o periodo</w:t>
-      </w:r>
-    </w:p>
-    <w:p>
-      <w:pPr>
-        <w:pStyle w:val="Prrafodelista"/>
-        <w:numPr>
-          <w:ilvl w:val="0"/>
-          <w:numId w:val="2"/>
-        </w:numPr>
-        <w:spacing w:before="50" w:after="50"/>
-      </w:pPr>
-      <w:r>
-        <w:rPr>
-          <w:color w:val="111827"/>
-        </w:rPr>
-        <w:t xml:space="preserve">Notificaciones </w:t>
-      </w:r>
-      <w:proofErr w:type="spellStart"/>
-      <w:r>
-        <w:rPr>
-          <w:color w:val="111827"/>
-        </w:rPr>
-        <w:t>push</w:t>
-      </w:r>
-      <w:proofErr w:type="spellEnd"/>
-      <w:r>
-        <w:rPr>
-          <w:color w:val="111827"/>
-        </w:rPr>
-        <w:t xml:space="preserve"> en navegador para nuevas novedades en tiempo real</w:t>
-      </w:r>
-    </w:p>
-    <w:p>
-      <w:pPr>
-        <w:pStyle w:val="Prrafodelista"/>
-        <w:numPr>
-          <w:ilvl w:val="0"/>
-          <w:numId w:val="2"/>
-        </w:numPr>
-        <w:spacing w:before="50" w:after="50"/>
-      </w:pPr>
-      <w:proofErr w:type="spellStart"/>
-      <w:r>
-        <w:rPr>
-          <w:color w:val="111827"/>
-        </w:rPr>
-        <w:t>Aplicacion</w:t>
-      </w:r>
-      <w:proofErr w:type="spellEnd"/>
-      <w:r>
-        <w:rPr>
-          <w:color w:val="111827"/>
-        </w:rPr>
-        <w:t xml:space="preserve"> </w:t>
-      </w:r>
-      <w:proofErr w:type="spellStart"/>
-      <w:r>
-        <w:rPr>
-          <w:color w:val="111827"/>
-        </w:rPr>
-        <w:t>movil</w:t>
-      </w:r>
-      <w:proofErr w:type="spellEnd"/>
-      <w:r>
-        <w:rPr>
-          <w:color w:val="111827"/>
-        </w:rPr>
-        <w:t xml:space="preserve"> PWA instalable en Android e iOS</w:t>
-      </w:r>
-    </w:p>
-    <w:p>
-      <w:pPr>
-        <w:pStyle w:val="Prrafodelista"/>
-        <w:numPr>
-          <w:ilvl w:val="0"/>
-          <w:numId w:val="2"/>
-        </w:numPr>
-        <w:spacing w:before="50" w:after="50"/>
-      </w:pPr>
-      <w:proofErr w:type="spellStart"/>
-      <w:r>
-        <w:rPr>
-          <w:color w:val="111827"/>
-        </w:rPr>
         <w:t>Integracion</w:t>
       </w:r>
       <w:proofErr w:type="spellEnd"/>
@@ -3111,7 +3657,7 @@
         <w:rPr>
           <w:color w:val="111827"/>
         </w:rPr>
-        <w:t xml:space="preserve"> con plataformas externas </w:t>
+        <w:t xml:space="preserve"> con plataformas LMS </w:t>
       </w:r>
       <w:proofErr w:type="spellStart"/>
       <w:r>
@@ -3126,68 +3672,6 @@
           <w:color w:val="111827"/>
         </w:rPr>
         <w:t xml:space="preserve"> API REST</w:t>
-      </w:r>
-    </w:p>
-    <w:p>
-      <w:pPr>
-        <w:pStyle w:val="Prrafodelista"/>
-        <w:numPr>
-          <w:ilvl w:val="0"/>
-          <w:numId w:val="2"/>
-        </w:numPr>
-        <w:spacing w:before="50" w:after="50"/>
-      </w:pPr>
-      <w:proofErr w:type="spellStart"/>
-      <w:r>
-        <w:rPr>
-          <w:color w:val="111827"/>
-        </w:rPr>
-        <w:t>Multi-organizacion</w:t>
-      </w:r>
-      <w:proofErr w:type="spellEnd"/>
-      <w:r>
-        <w:rPr>
-          <w:color w:val="111827"/>
-        </w:rPr>
-        <w:t xml:space="preserve"> con aislamiento de datos por empresa</w:t>
-      </w:r>
-    </w:p>
-    <w:p>
-      <w:pPr>
-        <w:pStyle w:val="Prrafodelista"/>
-        <w:numPr>
-          <w:ilvl w:val="0"/>
-          <w:numId w:val="2"/>
-        </w:numPr>
-        <w:spacing w:before="50" w:after="50"/>
-      </w:pPr>
-      <w:proofErr w:type="spellStart"/>
-      <w:r>
-        <w:rPr>
-          <w:color w:val="111827"/>
-        </w:rPr>
-        <w:t>Dashboard</w:t>
-      </w:r>
-      <w:proofErr w:type="spellEnd"/>
-      <w:r>
-        <w:rPr>
-          <w:color w:val="111827"/>
-        </w:rPr>
-        <w:t xml:space="preserve"> </w:t>
-      </w:r>
-      <w:proofErr w:type="spellStart"/>
-      <w:r>
-        <w:rPr>
-          <w:color w:val="111827"/>
-        </w:rPr>
-        <w:t>analitico</w:t>
-      </w:r>
-      <w:proofErr w:type="spellEnd"/>
-      <w:r>
-        <w:rPr>
-          <w:color w:val="111827"/>
-        </w:rPr>
-        <w:t xml:space="preserve"> con graficas de tendencias de absentismo</w:t>
       </w:r>
     </w:p>
     <w:p>
@@ -3236,7 +3720,7 @@
           <w:left w:w="10" w:type="dxa"/>
           <w:right w:w="10" w:type="dxa"/>
         </w:tblCellMar>
-        <w:tblLook w:val="04A0" w:firstRow="1" w:lastRow="0" w:firstColumn="1" w:lastColumn="0" w:noHBand="0" w:noVBand="1"/>
+        <w:tblLook w:val="0000" w:firstRow="0" w:lastRow="0" w:firstColumn="0" w:lastColumn="0" w:noHBand="0" w:noVBand="0"/>
       </w:tblPr>
       <w:tblGrid>
         <w:gridCol w:w="4400"/>
@@ -3244,6 +3728,12 @@
         <w:gridCol w:w="3360"/>
       </w:tblGrid>
       <w:tr>
+        <w:tblPrEx>
+          <w:tblCellMar>
+            <w:top w:w="0" w:type="dxa"/>
+            <w:bottom w:w="0" w:type="dxa"/>
+          </w:tblCellMar>
+        </w:tblPrEx>
         <w:tc>
           <w:tcPr>
             <w:tcW w:w="4400" w:type="dxa"/>
@@ -3336,6 +3826,12 @@
         </w:tc>
       </w:tr>
       <w:tr>
+        <w:tblPrEx>
+          <w:tblCellMar>
+            <w:top w:w="0" w:type="dxa"/>
+            <w:bottom w:w="0" w:type="dxa"/>
+          </w:tblCellMar>
+        </w:tblPrEx>
         <w:tc>
           <w:tcPr>
             <w:tcW w:w="4400" w:type="dxa"/>
@@ -3360,7 +3856,7 @@
                 <w:sz w:val="20"/>
                 <w:szCs w:val="20"/>
               </w:rPr>
-              <w:t xml:space="preserve">Configurar base de datos MySQL y ejecutar </w:t>
+              <w:t xml:space="preserve">Configurar MySQL y ejecutar </w:t>
             </w:r>
             <w:proofErr w:type="spellStart"/>
             <w:r>
@@ -3442,6 +3938,12 @@
         </w:tc>
       </w:tr>
       <w:tr>
+        <w:tblPrEx>
+          <w:tblCellMar>
+            <w:top w:w="0" w:type="dxa"/>
+            <w:bottom w:w="0" w:type="dxa"/>
+          </w:tblCellMar>
+        </w:tblPrEx>
         <w:tc>
           <w:tcPr>
             <w:tcW w:w="4400" w:type="dxa"/>
@@ -3528,6 +4030,12 @@
         </w:tc>
       </w:tr>
       <w:tr>
+        <w:tblPrEx>
+          <w:tblCellMar>
+            <w:top w:w="0" w:type="dxa"/>
+            <w:bottom w:w="0" w:type="dxa"/>
+          </w:tblCellMar>
+        </w:tblPrEx>
         <w:tc>
           <w:tcPr>
             <w:tcW w:w="4400" w:type="dxa"/>
@@ -3564,14 +4072,6 @@
               <w:t>backend</w:t>
             </w:r>
             <w:proofErr w:type="spellEnd"/>
-            <w:r>
-              <w:rPr>
-                <w:color w:val="111827"/>
-                <w:sz w:val="20"/>
-                <w:szCs w:val="20"/>
-              </w:rPr>
-              <w:t xml:space="preserve"> en Render</w:t>
-            </w:r>
           </w:p>
         </w:tc>
         <w:tc>
@@ -3642,6 +4142,12 @@
         </w:tc>
       </w:tr>
       <w:tr>
+        <w:tblPrEx>
+          <w:tblCellMar>
+            <w:top w:w="0" w:type="dxa"/>
+            <w:bottom w:w="0" w:type="dxa"/>
+          </w:tblCellMar>
+        </w:tblPrEx>
         <w:tc>
           <w:tcPr>
             <w:tcW w:w="4400" w:type="dxa"/>
@@ -3666,25 +4172,7 @@
                 <w:sz w:val="20"/>
                 <w:szCs w:val="20"/>
               </w:rPr>
-              <w:t>Configurar MongoDB Atlas (</w:t>
-            </w:r>
-            <w:proofErr w:type="spellStart"/>
-            <w:r>
-              <w:rPr>
-                <w:color w:val="111827"/>
-                <w:sz w:val="20"/>
-                <w:szCs w:val="20"/>
-              </w:rPr>
-              <w:t>cluster</w:t>
-            </w:r>
-            <w:proofErr w:type="spellEnd"/>
-            <w:r>
-              <w:rPr>
-                <w:color w:val="111827"/>
-                <w:sz w:val="20"/>
-                <w:szCs w:val="20"/>
-              </w:rPr>
-              <w:t xml:space="preserve"> M0 gratuito)</w:t>
+              <w:t>Configurar MongoDB Atlas</w:t>
             </w:r>
           </w:p>
         </w:tc>
@@ -3756,6 +4244,12 @@
         </w:tc>
       </w:tr>
       <w:tr>
+        <w:tblPrEx>
+          <w:tblCellMar>
+            <w:top w:w="0" w:type="dxa"/>
+            <w:bottom w:w="0" w:type="dxa"/>
+          </w:tblCellMar>
+        </w:tblPrEx>
         <w:tc>
           <w:tcPr>
             <w:tcW w:w="4400" w:type="dxa"/>
@@ -3880,6 +4374,12 @@
         </w:tc>
       </w:tr>
       <w:tr>
+        <w:tblPrEx>
+          <w:tblCellMar>
+            <w:top w:w="0" w:type="dxa"/>
+            <w:bottom w:w="0" w:type="dxa"/>
+          </w:tblCellMar>
+        </w:tblPrEx>
         <w:tc>
           <w:tcPr>
             <w:tcW w:w="4400" w:type="dxa"/>
@@ -4004,6 +4504,12 @@
         </w:tc>
       </w:tr>
       <w:tr>
+        <w:tblPrEx>
+          <w:tblCellMar>
+            <w:top w:w="0" w:type="dxa"/>
+            <w:bottom w:w="0" w:type="dxa"/>
+          </w:tblCellMar>
+        </w:tblPrEx>
         <w:tc>
           <w:tcPr>
             <w:tcW w:w="4400" w:type="dxa"/>
@@ -4110,6 +4616,12 @@
         </w:tc>
       </w:tr>
       <w:tr>
+        <w:tblPrEx>
+          <w:tblCellMar>
+            <w:top w:w="0" w:type="dxa"/>
+            <w:bottom w:w="0" w:type="dxa"/>
+          </w:tblCellMar>
+        </w:tblPrEx>
         <w:tc>
           <w:tcPr>
             <w:tcW w:w="4400" w:type="dxa"/>
@@ -4144,7 +4656,7 @@
                 <w:sz w:val="20"/>
                 <w:szCs w:val="20"/>
               </w:rPr>
-              <w:t xml:space="preserve"> del equipo administrativo</w:t>
+              <w:t xml:space="preserve"> administradores</w:t>
             </w:r>
           </w:p>
         </w:tc>
@@ -4216,6 +4728,12 @@
         </w:tc>
       </w:tr>
       <w:tr>
+        <w:tblPrEx>
+          <w:tblCellMar>
+            <w:top w:w="0" w:type="dxa"/>
+            <w:bottom w:w="0" w:type="dxa"/>
+          </w:tblCellMar>
+        </w:tblPrEx>
         <w:tc>
           <w:tcPr>
             <w:tcW w:w="4400" w:type="dxa"/>
@@ -4250,7 +4768,7 @@
                 <w:sz w:val="20"/>
                 <w:szCs w:val="20"/>
               </w:rPr>
-              <w:t xml:space="preserve"> de usuarios</w:t>
+              <w:t xml:space="preserve"> usuarios</w:t>
             </w:r>
           </w:p>
         </w:tc>
@@ -4314,6 +4832,12 @@
         </w:tc>
       </w:tr>
       <w:tr>
+        <w:tblPrEx>
+          <w:tblCellMar>
+            <w:top w:w="0" w:type="dxa"/>
+            <w:bottom w:w="0" w:type="dxa"/>
+          </w:tblCellMar>
+        </w:tblPrEx>
         <w:tc>
           <w:tcPr>
             <w:tcW w:w="4400" w:type="dxa"/>
@@ -4440,7 +4964,22 @@
         <w:rPr>
           <w:color w:val="111827"/>
         </w:rPr>
-        <w:t xml:space="preserve">NOVA resuelve un problema real y cotidiano en la </w:t>
+        <w:lastRenderedPageBreak/>
+        <w:t xml:space="preserve">NOVA v1.0 es la primera </w:t>
+      </w:r>
+      <w:proofErr w:type="spellStart"/>
+      <w:r>
+        <w:rPr>
+          <w:color w:val="111827"/>
+        </w:rPr>
+        <w:t>version</w:t>
+      </w:r>
+      <w:proofErr w:type="spellEnd"/>
+      <w:r>
+        <w:rPr>
+          <w:color w:val="111827"/>
+        </w:rPr>
+        <w:t xml:space="preserve"> estable de una plataforma que resuelve un problema real, cotidiano y de alto impacto en la </w:t>
       </w:r>
       <w:proofErr w:type="spellStart"/>
       <w:r>
@@ -4482,35 +5021,35 @@
         <w:rPr>
           <w:color w:val="111827"/>
         </w:rPr>
-        <w:t xml:space="preserve">: la </w:t>
-      </w:r>
-      <w:proofErr w:type="spellStart"/>
-      <w:r>
-        <w:rPr>
-          <w:color w:val="111827"/>
-        </w:rPr>
-        <w:t>administracion</w:t>
-      </w:r>
-      <w:proofErr w:type="spellEnd"/>
-      <w:r>
-        <w:rPr>
-          <w:color w:val="111827"/>
-        </w:rPr>
-        <w:t xml:space="preserve"> informal y no trazable de ausencias. Lo hace con una </w:t>
-      </w:r>
-      <w:proofErr w:type="spellStart"/>
-      <w:r>
-        <w:rPr>
-          <w:color w:val="111827"/>
-        </w:rPr>
-        <w:t>solucion</w:t>
-      </w:r>
-      <w:proofErr w:type="spellEnd"/>
-      <w:r>
-        <w:rPr>
-          <w:color w:val="111827"/>
-        </w:rPr>
-        <w:t xml:space="preserve"> digital completa que incluye inteligencia artificial nativa, </w:t>
+        <w:t xml:space="preserve">. Lanzada en 2026, combina inteligencia artificial de ultima </w:t>
+      </w:r>
+      <w:proofErr w:type="spellStart"/>
+      <w:r>
+        <w:rPr>
+          <w:color w:val="111827"/>
+        </w:rPr>
+        <w:t>generacion</w:t>
+      </w:r>
+      <w:proofErr w:type="spellEnd"/>
+      <w:r>
+        <w:rPr>
+          <w:color w:val="111827"/>
+        </w:rPr>
+        <w:t xml:space="preserve">, seguridad de nivel </w:t>
+      </w:r>
+      <w:proofErr w:type="spellStart"/>
+      <w:r>
+        <w:rPr>
+          <w:color w:val="111827"/>
+        </w:rPr>
+        <w:t>basico</w:t>
+      </w:r>
+      <w:proofErr w:type="spellEnd"/>
+      <w:r>
+        <w:rPr>
+          <w:color w:val="111827"/>
+        </w:rPr>
+        <w:t xml:space="preserve"> certificada, </w:t>
       </w:r>
       <w:proofErr w:type="spellStart"/>
       <w:r>
@@ -4538,7 +5077,21 @@
         <w:rPr>
           <w:color w:val="111827"/>
         </w:rPr>
-        <w:t xml:space="preserve"> por email a cualquier correo del mundo, historial de auditoria completo y experiencia de usuario cuidada en todos los flujos.</w:t>
+        <w:t xml:space="preserve"> por email a cualquier correo del mundo y un costo de </w:t>
+      </w:r>
+      <w:proofErr w:type="spellStart"/>
+      <w:r>
+        <w:rPr>
+          <w:color w:val="111827"/>
+        </w:rPr>
+        <w:t>operacion</w:t>
+      </w:r>
+      <w:proofErr w:type="spellEnd"/>
+      <w:r>
+        <w:rPr>
+          <w:color w:val="111827"/>
+        </w:rPr>
+        <w:t xml:space="preserve"> de $7 USD mensuales.</w:t>
       </w:r>
     </w:p>
     <w:p>
@@ -4549,35 +5102,21 @@
         <w:rPr>
           <w:color w:val="111827"/>
         </w:rPr>
-        <w:t xml:space="preserve">Con un costo fijo de $7 USD mensuales — el </w:t>
-      </w:r>
-      <w:proofErr w:type="spellStart"/>
-      <w:r>
-        <w:rPr>
-          <w:color w:val="111827"/>
-        </w:rPr>
-        <w:t>unico</w:t>
-      </w:r>
-      <w:proofErr w:type="spellEnd"/>
-      <w:r>
-        <w:rPr>
-          <w:color w:val="111827"/>
-        </w:rPr>
-        <w:t xml:space="preserve"> gasto real del sistema — NOVA esta lista para </w:t>
-      </w:r>
-      <w:proofErr w:type="spellStart"/>
-      <w:r>
-        <w:rPr>
-          <w:color w:val="111827"/>
-        </w:rPr>
-        <w:t>produccion</w:t>
-      </w:r>
-      <w:proofErr w:type="spellEnd"/>
-      <w:r>
-        <w:rPr>
-          <w:color w:val="111827"/>
-        </w:rPr>
-        <w:t xml:space="preserve">, desplegada en la nube y disponible para ser adoptada de inmediato por cualquier </w:t>
+        <w:t xml:space="preserve">Con una puesta en marcha de 4 a 5 horas y sin requerir infraestructura propia, NOVA v1.0 </w:t>
+      </w:r>
+      <w:proofErr w:type="spellStart"/>
+      <w:r>
+        <w:rPr>
+          <w:color w:val="111827"/>
+        </w:rPr>
+        <w:t>esta</w:t>
+      </w:r>
+      <w:proofErr w:type="spellEnd"/>
+      <w:r>
+        <w:rPr>
+          <w:color w:val="111827"/>
+        </w:rPr>
+        <w:t xml:space="preserve"> lista para ser adoptada por cualquier </w:t>
       </w:r>
       <w:proofErr w:type="spellStart"/>
       <w:r>
@@ -4605,7 +5144,7 @@
         <w:rPr>
           <w:color w:val="111827"/>
         </w:rPr>
-        <w:t xml:space="preserve"> de su personal.</w:t>
+        <w:t xml:space="preserve"> de ausencias de su equipo.</w:t>
       </w:r>
     </w:p>
     <w:sectPr>
@@ -4719,7 +5258,7 @@
         <w:sz w:val="18"/>
         <w:szCs w:val="18"/>
       </w:rPr>
-      <w:t>NOVA v2.0 — Informe Comercial</w:t>
+      <w:t>NOVA v1.0 — Informe Comercial</w:t>
     </w:r>
   </w:p>
 </w:hdr>
@@ -4728,118 +5267,118 @@
 <file path=word/numbering.xml><?xml version="1.0" encoding="utf-8"?>
 <w:numbering xmlns:wpc="http://schemas.microsoft.com/office/word/2010/wordprocessingCanvas" xmlns:cx="http://schemas.microsoft.com/office/drawing/2014/chartex" xmlns:cx1="http://schemas.microsoft.com/office/drawing/2015/9/8/chartex" xmlns:cx2="http://schemas.microsoft.com/office/drawing/2015/10/21/chartex" xmlns:cx3="http://schemas.microsoft.com/office/drawing/2016/5/9/chartex" xmlns:cx4="http://schemas.microsoft.com/office/drawing/2016/5/10/chartex" xmlns:cx5="http://schemas.microsoft.com/office/drawing/2016/5/11/chartex" xmlns:cx6="http://schemas.microsoft.com/office/drawing/2016/5/12/chartex" xmlns:cx7="http://schemas.microsoft.com/office/drawing/2016/5/13/chartex" xmlns:cx8="http://schemas.microsoft.com/office/drawing/2016/5/14/chartex" xmlns:mc="http://schemas.openxmlformats.org/markup-compatibility/2006" xmlns:aink="http://schemas.microsoft.com/office/drawing/2016/ink" xmlns:am3d="http://schemas.microsoft.com/office/drawing/2017/model3d" xmlns:o="urn:schemas-microsoft-com:office:office" xmlns:oel="http://schemas.microsoft.com/office/2019/extlst" xmlns:r="http://schemas.openxmlformats.org/officeDocument/2006/relationships" xmlns:m="http://schemas.openxmlformats.org/officeDocument/2006/math" xmlns:v="urn:schemas-microsoft-com:vml" xmlns:wp14="http://schemas.microsoft.com/office/word/2010/wordprocessingDrawing" xmlns:wp="http://schemas.openxmlformats.org/drawingml/2006/wordprocessingDrawing" xmlns:w10="urn:schemas-microsoft-com:office:word" xmlns:w="http://schemas.openxmlformats.org/wordprocessingml/2006/main" xmlns:w14="http://schemas.microsoft.com/office/word/2010/wordml" xmlns:w15="http://schemas.microsoft.com/office/word/2012/wordml" xmlns:w16cex="http://schemas.microsoft.com/office/word/2018/wordml/cex" xmlns:w16cid="http://schemas.microsoft.com/office/word/2016/wordml/cid" xmlns:w16="http://schemas.microsoft.com/office/word/2018/wordml" xmlns:w16du="http://schemas.microsoft.com/office/word/2023/wordml/word16du" xmlns:w16sdtdh="http://schemas.microsoft.com/office/word/2020/wordml/sdtdatahash" xmlns:w16sdtfl="http://schemas.microsoft.com/office/word/2024/wordml/sdtformatlock" xmlns:w16se="http://schemas.microsoft.com/office/word/2015/wordml/symex" xmlns:wpg="http://schemas.microsoft.com/office/word/2010/wordprocessingGroup" xmlns:wpi="http://schemas.microsoft.com/office/word/2010/wordprocessingInk" xmlns:wne="http://schemas.microsoft.com/office/word/2006/wordml" xmlns:wps="http://schemas.microsoft.com/office/word/2010/wordprocessingShape" mc:Ignorable="w14 w15 w16se w16cid w16 w16cex w16sdtdh w16sdtfl w16du wp14">
   <w:abstractNum w:abstractNumId="0" w15:restartNumberingAfterBreak="0">
-    <w:nsid w:val="13A42066"/>
+    <w:nsid w:val="0F3E7584"/>
     <w:multiLevelType w:val="hybridMultilevel"/>
-    <w:tmpl w:val="593E0358"/>
-    <w:lvl w:ilvl="0" w:tplc="81BEE120">
+    <w:tmpl w:val="43768D64"/>
+    <w:lvl w:ilvl="0" w:tplc="ACE6A1DA">
       <w:start w:val="1"/>
-      <w:numFmt w:val="bullet"/>
-      <w:lvlText w:val="◦"/>
+      <w:numFmt w:val="decimal"/>
+      <w:lvlText w:val="%1."/>
       <w:lvlJc w:val="left"/>
       <w:pPr>
-        <w:ind w:left="1080" w:hanging="360"/>
+        <w:ind w:left="720" w:hanging="360"/>
       </w:pPr>
     </w:lvl>
-    <w:lvl w:ilvl="1" w:tplc="493CE972">
+    <w:lvl w:ilvl="1" w:tplc="CD0256B0">
       <w:numFmt w:val="decimal"/>
       <w:lvlText w:val=""/>
       <w:lvlJc w:val="left"/>
     </w:lvl>
-    <w:lvl w:ilvl="2" w:tplc="3B56DC54">
+    <w:lvl w:ilvl="2" w:tplc="032ABCF6">
       <w:numFmt w:val="decimal"/>
       <w:lvlText w:val=""/>
       <w:lvlJc w:val="left"/>
     </w:lvl>
-    <w:lvl w:ilvl="3" w:tplc="04B85F90">
+    <w:lvl w:ilvl="3" w:tplc="CF84BB76">
       <w:numFmt w:val="decimal"/>
       <w:lvlText w:val=""/>
       <w:lvlJc w:val="left"/>
     </w:lvl>
-    <w:lvl w:ilvl="4" w:tplc="76C87042">
+    <w:lvl w:ilvl="4" w:tplc="1C683B08">
       <w:numFmt w:val="decimal"/>
       <w:lvlText w:val=""/>
       <w:lvlJc w:val="left"/>
     </w:lvl>
-    <w:lvl w:ilvl="5" w:tplc="EC2612C2">
+    <w:lvl w:ilvl="5" w:tplc="F8822F20">
       <w:numFmt w:val="decimal"/>
       <w:lvlText w:val=""/>
       <w:lvlJc w:val="left"/>
     </w:lvl>
-    <w:lvl w:ilvl="6" w:tplc="236897CA">
+    <w:lvl w:ilvl="6" w:tplc="4912AE3A">
       <w:numFmt w:val="decimal"/>
       <w:lvlText w:val=""/>
       <w:lvlJc w:val="left"/>
     </w:lvl>
-    <w:lvl w:ilvl="7" w:tplc="C92AF156">
+    <w:lvl w:ilvl="7" w:tplc="6938F6F8">
       <w:numFmt w:val="decimal"/>
       <w:lvlText w:val=""/>
       <w:lvlJc w:val="left"/>
     </w:lvl>
-    <w:lvl w:ilvl="8" w:tplc="1EDE9830">
+    <w:lvl w:ilvl="8" w:tplc="200A6054">
       <w:numFmt w:val="decimal"/>
       <w:lvlText w:val=""/>
       <w:lvlJc w:val="left"/>
     </w:lvl>
   </w:abstractNum>
   <w:abstractNum w:abstractNumId="1" w15:restartNumberingAfterBreak="0">
-    <w:nsid w:val="2E675531"/>
+    <w:nsid w:val="4E850FDB"/>
     <w:multiLevelType w:val="hybridMultilevel"/>
-    <w:tmpl w:val="047C81EE"/>
-    <w:lvl w:ilvl="0" w:tplc="E8EAF51C">
+    <w:tmpl w:val="03008B1A"/>
+    <w:lvl w:ilvl="0" w:tplc="C92AEB42">
       <w:start w:val="1"/>
       <w:numFmt w:val="bullet"/>
-      <w:lvlText w:val="•"/>
+      <w:lvlText w:val="◦"/>
       <w:lvlJc w:val="left"/>
       <w:pPr>
-        <w:ind w:left="720" w:hanging="360"/>
+        <w:ind w:left="1080" w:hanging="360"/>
       </w:pPr>
     </w:lvl>
-    <w:lvl w:ilvl="1" w:tplc="B4D85416">
+    <w:lvl w:ilvl="1" w:tplc="D8E0941C">
       <w:numFmt w:val="decimal"/>
       <w:lvlText w:val=""/>
       <w:lvlJc w:val="left"/>
     </w:lvl>
-    <w:lvl w:ilvl="2" w:tplc="52F049C2">
+    <w:lvl w:ilvl="2" w:tplc="A38A52B0">
       <w:numFmt w:val="decimal"/>
       <w:lvlText w:val=""/>
       <w:lvlJc w:val="left"/>
     </w:lvl>
-    <w:lvl w:ilvl="3" w:tplc="19BCA10E">
+    <w:lvl w:ilvl="3" w:tplc="C55E1DF8">
       <w:numFmt w:val="decimal"/>
       <w:lvlText w:val=""/>
       <w:lvlJc w:val="left"/>
     </w:lvl>
-    <w:lvl w:ilvl="4" w:tplc="42F8A1D2">
+    <w:lvl w:ilvl="4" w:tplc="228E020E">
       <w:numFmt w:val="decimal"/>
       <w:lvlText w:val=""/>
       <w:lvlJc w:val="left"/>
     </w:lvl>
-    <w:lvl w:ilvl="5" w:tplc="A5A888DC">
+    <w:lvl w:ilvl="5" w:tplc="4E64DD76">
       <w:numFmt w:val="decimal"/>
       <w:lvlText w:val=""/>
       <w:lvlJc w:val="left"/>
     </w:lvl>
-    <w:lvl w:ilvl="6" w:tplc="E0D04328">
+    <w:lvl w:ilvl="6" w:tplc="8116A66E">
       <w:numFmt w:val="decimal"/>
       <w:lvlText w:val=""/>
       <w:lvlJc w:val="left"/>
     </w:lvl>
-    <w:lvl w:ilvl="7" w:tplc="CE808648">
+    <w:lvl w:ilvl="7" w:tplc="6FD250D4">
       <w:numFmt w:val="decimal"/>
       <w:lvlText w:val=""/>
       <w:lvlJc w:val="left"/>
     </w:lvl>
-    <w:lvl w:ilvl="8" w:tplc="F0B88132">
+    <w:lvl w:ilvl="8" w:tplc="5E92687E">
       <w:numFmt w:val="decimal"/>
       <w:lvlText w:val=""/>
       <w:lvlJc w:val="left"/>
     </w:lvl>
   </w:abstractNum>
   <w:abstractNum w:abstractNumId="2" w15:restartNumberingAfterBreak="0">
-    <w:nsid w:val="2FA34026"/>
+    <w:nsid w:val="50470B21"/>
     <w:multiLevelType w:val="hybridMultilevel"/>
-    <w:tmpl w:val="53A67AFC"/>
-    <w:lvl w:ilvl="0" w:tplc="84A88032">
+    <w:tmpl w:val="79E249C0"/>
+    <w:lvl w:ilvl="0" w:tplc="9B0A6C54">
       <w:start w:val="1"/>
       <w:numFmt w:val="bullet"/>
       <w:lvlText w:val="●"/>
@@ -4848,7 +5387,7 @@
         <w:ind w:left="720" w:hanging="360"/>
       </w:pPr>
     </w:lvl>
-    <w:lvl w:ilvl="1" w:tplc="9256698E">
+    <w:lvl w:ilvl="1" w:tplc="4B72BD44">
       <w:start w:val="1"/>
       <w:numFmt w:val="bullet"/>
       <w:lvlText w:val="○"/>
@@ -4857,7 +5396,7 @@
         <w:ind w:left="1440" w:hanging="360"/>
       </w:pPr>
     </w:lvl>
-    <w:lvl w:ilvl="2" w:tplc="FEA6AAFA">
+    <w:lvl w:ilvl="2" w:tplc="6A800D80">
       <w:start w:val="1"/>
       <w:numFmt w:val="bullet"/>
       <w:lvlText w:val="■"/>
@@ -4866,7 +5405,7 @@
         <w:ind w:left="2160" w:hanging="360"/>
       </w:pPr>
     </w:lvl>
-    <w:lvl w:ilvl="3" w:tplc="AAB8BF58">
+    <w:lvl w:ilvl="3" w:tplc="33525E9E">
       <w:start w:val="1"/>
       <w:numFmt w:val="bullet"/>
       <w:lvlText w:val="●"/>
@@ -4875,7 +5414,7 @@
         <w:ind w:left="2880" w:hanging="360"/>
       </w:pPr>
     </w:lvl>
-    <w:lvl w:ilvl="4" w:tplc="0F56BEB6">
+    <w:lvl w:ilvl="4" w:tplc="42D67188">
       <w:start w:val="1"/>
       <w:numFmt w:val="bullet"/>
       <w:lvlText w:val="○"/>
@@ -4884,7 +5423,7 @@
         <w:ind w:left="3600" w:hanging="360"/>
       </w:pPr>
     </w:lvl>
-    <w:lvl w:ilvl="5" w:tplc="C590B9DA">
+    <w:lvl w:ilvl="5" w:tplc="D16A6F42">
       <w:start w:val="1"/>
       <w:numFmt w:val="bullet"/>
       <w:lvlText w:val="■"/>
@@ -4893,7 +5432,7 @@
         <w:ind w:left="4320" w:hanging="360"/>
       </w:pPr>
     </w:lvl>
-    <w:lvl w:ilvl="6" w:tplc="6F301348">
+    <w:lvl w:ilvl="6" w:tplc="C0B443A6">
       <w:start w:val="1"/>
       <w:numFmt w:val="bullet"/>
       <w:lvlText w:val="●"/>
@@ -4902,7 +5441,7 @@
         <w:ind w:left="5040" w:hanging="360"/>
       </w:pPr>
     </w:lvl>
-    <w:lvl w:ilvl="7" w:tplc="202A64A0">
+    <w:lvl w:ilvl="7" w:tplc="83B681A6">
       <w:start w:val="1"/>
       <w:numFmt w:val="bullet"/>
       <w:lvlText w:val="●"/>
@@ -4911,7 +5450,7 @@
         <w:ind w:left="5760" w:hanging="360"/>
       </w:pPr>
     </w:lvl>
-    <w:lvl w:ilvl="8" w:tplc="E042F4A6">
+    <w:lvl w:ilvl="8" w:tplc="2FC87FF6">
       <w:start w:val="1"/>
       <w:numFmt w:val="bullet"/>
       <w:lvlText w:val="●"/>
@@ -4922,67 +5461,67 @@
     </w:lvl>
   </w:abstractNum>
   <w:abstractNum w:abstractNumId="3" w15:restartNumberingAfterBreak="0">
-    <w:nsid w:val="7155120C"/>
+    <w:nsid w:val="62523129"/>
     <w:multiLevelType w:val="hybridMultilevel"/>
-    <w:tmpl w:val="2E608230"/>
-    <w:lvl w:ilvl="0" w:tplc="E384DCF2">
+    <w:tmpl w:val="572C8C92"/>
+    <w:lvl w:ilvl="0" w:tplc="51ACCAAA">
       <w:start w:val="1"/>
-      <w:numFmt w:val="decimal"/>
-      <w:lvlText w:val="%1."/>
+      <w:numFmt w:val="bullet"/>
+      <w:lvlText w:val="•"/>
       <w:lvlJc w:val="left"/>
       <w:pPr>
         <w:ind w:left="720" w:hanging="360"/>
       </w:pPr>
     </w:lvl>
-    <w:lvl w:ilvl="1" w:tplc="D8B8BD5C">
+    <w:lvl w:ilvl="1" w:tplc="98EC33EA">
       <w:numFmt w:val="decimal"/>
       <w:lvlText w:val=""/>
       <w:lvlJc w:val="left"/>
     </w:lvl>
-    <w:lvl w:ilvl="2" w:tplc="E2241C18">
+    <w:lvl w:ilvl="2" w:tplc="125A45DA">
       <w:numFmt w:val="decimal"/>
       <w:lvlText w:val=""/>
       <w:lvlJc w:val="left"/>
     </w:lvl>
-    <w:lvl w:ilvl="3" w:tplc="4DD8CD94">
+    <w:lvl w:ilvl="3" w:tplc="4F829164">
       <w:numFmt w:val="decimal"/>
       <w:lvlText w:val=""/>
       <w:lvlJc w:val="left"/>
     </w:lvl>
-    <w:lvl w:ilvl="4" w:tplc="5186071A">
+    <w:lvl w:ilvl="4" w:tplc="227A16D6">
       <w:numFmt w:val="decimal"/>
       <w:lvlText w:val=""/>
       <w:lvlJc w:val="left"/>
     </w:lvl>
-    <w:lvl w:ilvl="5" w:tplc="CE2882CA">
+    <w:lvl w:ilvl="5" w:tplc="7342103A">
       <w:numFmt w:val="decimal"/>
       <w:lvlText w:val=""/>
       <w:lvlJc w:val="left"/>
     </w:lvl>
-    <w:lvl w:ilvl="6" w:tplc="0AEA1016">
+    <w:lvl w:ilvl="6" w:tplc="0150A832">
       <w:numFmt w:val="decimal"/>
       <w:lvlText w:val=""/>
       <w:lvlJc w:val="left"/>
     </w:lvl>
-    <w:lvl w:ilvl="7" w:tplc="89E21224">
+    <w:lvl w:ilvl="7" w:tplc="F5EC13BE">
       <w:numFmt w:val="decimal"/>
       <w:lvlText w:val=""/>
       <w:lvlJc w:val="left"/>
     </w:lvl>
-    <w:lvl w:ilvl="8" w:tplc="4B7E95F0">
+    <w:lvl w:ilvl="8" w:tplc="9C70200C">
       <w:numFmt w:val="decimal"/>
       <w:lvlText w:val=""/>
       <w:lvlJc w:val="left"/>
     </w:lvl>
   </w:abstractNum>
-  <w:num w:numId="1" w16cid:durableId="1520121824">
+  <w:num w:numId="1" w16cid:durableId="1799177344">
     <w:abstractNumId w:val="2"/>
     <w:lvlOverride w:ilvl="0">
       <w:startOverride w:val="1"/>
     </w:lvlOverride>
   </w:num>
-  <w:num w:numId="2" w16cid:durableId="19862761">
-    <w:abstractNumId w:val="1"/>
+  <w:num w:numId="2" w16cid:durableId="191311876">
+    <w:abstractNumId w:val="3"/>
     <w:lvlOverride w:ilvl="0">
       <w:startOverride w:val="1"/>
     </w:lvlOverride>

</xml_diff>